<commit_message>
Update on the site
</commit_message>
<xml_diff>
--- a/Plan for the website.docx
+++ b/Plan for the website.docx
@@ -604,6 +604,7 @@
         <w:rPr>
           <w:rStyle w:val="break-words"/>
         </w:rPr>
+        <w:lastRenderedPageBreak/>
         <w:t>Description: I participated in the UTOKYO/ICG Training on Global Navigation Satellite Systems (GNSS), held from 27th January to 1st February 2025 in Kathmandu, Nepal.</w:t>
       </w:r>
       <w:r>
@@ -1180,41 +1181,41 @@
         <w:rPr>
           <w:rStyle w:val="break-words"/>
         </w:rPr>
+        <w:t>5. Drone Surveying, Remote Mapping</w:t>
+      </w:r>
+      <w:r>
+        <w:br/>
+      </w:r>
+      <w:proofErr w:type="gramStart"/>
+      <w:r>
+        <w:rPr>
+          <w:rStyle w:val="break-words"/>
+        </w:rPr>
+        <w:t>This</w:t>
+      </w:r>
+      <w:proofErr w:type="gramEnd"/>
+      <w:r>
+        <w:rPr>
+          <w:rStyle w:val="break-words"/>
+        </w:rPr>
+        <w:t xml:space="preserve"> hands-on learning experience has greatly expanded my knowledge and skills in the field of geospatial technology, especially in the context of climate change research and monitoring. I'm grateful for the chance to learn from experts and collaborate with fellow participants. Looking forward to applying these insights in my future work!</w:t>
+      </w:r>
+    </w:p>
+    <w:p>
+      <w:r>
+        <w:t>Certificate Image:</w:t>
+      </w:r>
+      <w:r>
+        <w:t xml:space="preserve"> "C:\Users\Shradaya_Raj\Desktop\Personal website\public\images\certificates\Cligeos.jpeg"</w:t>
+      </w:r>
+      <w:r>
+        <w:t xml:space="preserve"> </w:t>
+      </w:r>
+    </w:p>
+    <w:p/>
+    <w:p>
+      <w:r>
         <w:lastRenderedPageBreak/>
-        <w:t>5. Drone Surveying, Remote Mapping</w:t>
-      </w:r>
-      <w:r>
-        <w:br/>
-      </w:r>
-      <w:proofErr w:type="gramStart"/>
-      <w:r>
-        <w:rPr>
-          <w:rStyle w:val="break-words"/>
-        </w:rPr>
-        <w:t>This</w:t>
-      </w:r>
-      <w:proofErr w:type="gramEnd"/>
-      <w:r>
-        <w:rPr>
-          <w:rStyle w:val="break-words"/>
-        </w:rPr>
-        <w:t xml:space="preserve"> hands-on learning experience has greatly expanded my knowledge and skills in the field of geospatial technology, especially in the context of climate change research and monitoring. I'm grateful for the chance to learn from experts and collaborate with fellow participants. Looking forward to applying these insights in my future work!</w:t>
-      </w:r>
-    </w:p>
-    <w:p>
-      <w:r>
-        <w:t>Certificate Image:</w:t>
-      </w:r>
-      <w:r>
-        <w:t xml:space="preserve"> "C:\Users\Shradaya_Raj\Desktop\Personal website\public\images\certificates\Cligeos.jpeg"</w:t>
-      </w:r>
-      <w:r>
-        <w:t xml:space="preserve"> </w:t>
-      </w:r>
-    </w:p>
-    <w:p/>
-    <w:p>
-      <w:r>
         <w:t>ESRI cartography:</w:t>
       </w:r>
     </w:p>
@@ -1977,6 +1978,7 @@
     </w:p>
     <w:p>
       <w:r>
+        <w:lastRenderedPageBreak/>
         <w:t>Total Station, Drones (Mavic 3E, Phantom 4 RTK), DJI FlightHub2, DRTK, DGPS, Kobo Collect, ODK Collect</w:t>
       </w:r>
     </w:p>
@@ -2141,8 +2143,6 @@
         </w:rPr>
         <w:t xml:space="preserve"> Campus, TU</w:t>
       </w:r>
-      <w:bookmarkStart w:id="0" w:name="_GoBack"/>
-      <w:bookmarkEnd w:id="0"/>
     </w:p>
     <w:p>
       <w:pPr>
@@ -2176,32 +2176,24 @@
           <w:sz w:val="22"/>
           <w:szCs w:val="22"/>
         </w:rPr>
-        <w:t xml:space="preserve"> selected for the Regionals in Thailand</w:t>
-      </w:r>
+        <w:t xml:space="preserve"> selected for the Regionals in Thailand from 15 competitive </w:t>
+      </w:r>
+      <w:proofErr w:type="spellStart"/>
       <w:r>
         <w:rPr>
           <w:color w:val="000000"/>
           <w:sz w:val="22"/>
           <w:szCs w:val="22"/>
         </w:rPr>
-        <w:t xml:space="preserve"> from 15 competitive </w:t>
-      </w:r>
-      <w:proofErr w:type="spellStart"/>
+        <w:t>tems</w:t>
+      </w:r>
+      <w:proofErr w:type="spellEnd"/>
       <w:r>
         <w:rPr>
           <w:color w:val="000000"/>
           <w:sz w:val="22"/>
           <w:szCs w:val="22"/>
         </w:rPr>
-        <w:t>tems</w:t>
-      </w:r>
-      <w:proofErr w:type="spellEnd"/>
-      <w:r>
-        <w:rPr>
-          <w:color w:val="000000"/>
-          <w:sz w:val="22"/>
-          <w:szCs w:val="22"/>
-        </w:rPr>
         <w:t>.</w:t>
       </w:r>
     </w:p>
@@ -2424,12 +2416,4072 @@
     </w:p>
     <w:p>
       <w:r>
+        <w:lastRenderedPageBreak/>
         <w:t>Add the new section as the projects and lists the project that has been done during the academic years, and working years when the headline being separate to different companies.</w:t>
       </w:r>
     </w:p>
     <w:p/>
+    <w:p/>
+    <w:p>
+      <w:r>
+        <w:rPr>
+          <w:b/>
+        </w:rPr>
+        <w:t>Project List</w:t>
+      </w:r>
+      <w:proofErr w:type="gramStart"/>
+      <w:r>
+        <w:rPr>
+          <w:b/>
+        </w:rPr>
+        <w:t>:</w:t>
+      </w:r>
+      <w:proofErr w:type="gramEnd"/>
+      <w:r>
+        <w:br/>
+        <w:t>in the project page, I want to show all the projects I have done.</w:t>
+      </w:r>
+      <w:r>
+        <w:br/>
+      </w:r>
+      <w:r>
+        <w:t>1.  Ums</w:t>
+      </w:r>
+    </w:p>
+    <w:p>
+      <w:r>
+        <w:t xml:space="preserve">2. </w:t>
+      </w:r>
+      <w:proofErr w:type="spellStart"/>
+      <w:r>
+        <w:t>Deurali</w:t>
+      </w:r>
+      <w:proofErr w:type="spellEnd"/>
+      <w:r>
+        <w:t xml:space="preserve"> Basic School</w:t>
+      </w:r>
+    </w:p>
+    <w:p>
+      <w:r>
+        <w:t xml:space="preserve">3. Drone Mapping </w:t>
+      </w:r>
+    </w:p>
+    <w:p>
+      <w:r>
+        <w:t xml:space="preserve">I have performed the drone mapping during my professional career. Some of the major mapping </w:t>
+      </w:r>
+      <w:proofErr w:type="gramStart"/>
+      <w:r>
+        <w:t>includes  the</w:t>
+      </w:r>
+      <w:proofErr w:type="gramEnd"/>
+      <w:r>
+        <w:t xml:space="preserve"> </w:t>
+      </w:r>
+      <w:proofErr w:type="spellStart"/>
+      <w:r>
+        <w:t>manaslu</w:t>
+      </w:r>
+      <w:proofErr w:type="spellEnd"/>
+      <w:r>
+        <w:t xml:space="preserve"> Region mapping(includes basecamp, glacier region, </w:t>
+      </w:r>
+      <w:proofErr w:type="spellStart"/>
+      <w:r>
+        <w:t>birendra</w:t>
+      </w:r>
+      <w:proofErr w:type="spellEnd"/>
+      <w:r>
+        <w:t xml:space="preserve"> lake and its catchment region, </w:t>
+      </w:r>
+      <w:proofErr w:type="spellStart"/>
+      <w:r>
+        <w:t>SamaGaun</w:t>
+      </w:r>
+      <w:proofErr w:type="spellEnd"/>
+      <w:r>
+        <w:t xml:space="preserve">), </w:t>
+      </w:r>
+      <w:proofErr w:type="spellStart"/>
+      <w:r>
+        <w:t>Banchare</w:t>
+      </w:r>
+      <w:proofErr w:type="spellEnd"/>
+      <w:r>
+        <w:t xml:space="preserve"> Dada Landfill Site (Landfill site for Kathmandu </w:t>
+      </w:r>
+      <w:proofErr w:type="spellStart"/>
+      <w:r>
+        <w:t>bhaktapur</w:t>
+      </w:r>
+      <w:proofErr w:type="spellEnd"/>
+      <w:r>
+        <w:t xml:space="preserve"> and </w:t>
+      </w:r>
+      <w:proofErr w:type="spellStart"/>
+      <w:r>
+        <w:t>lalitpur</w:t>
+      </w:r>
+      <w:proofErr w:type="spellEnd"/>
+      <w:r>
+        <w:t>) and River bank jungle resort mapping.</w:t>
+      </w:r>
+      <w:r>
+        <w:br/>
+      </w:r>
+      <w:proofErr w:type="gramStart"/>
+      <w:r>
+        <w:t>from</w:t>
+      </w:r>
+      <w:proofErr w:type="gramEnd"/>
+      <w:r>
+        <w:t xml:space="preserve"> the mapping, I made the </w:t>
+      </w:r>
+      <w:proofErr w:type="spellStart"/>
+      <w:r>
+        <w:t>orthomosaic</w:t>
+      </w:r>
+      <w:proofErr w:type="spellEnd"/>
+      <w:r>
+        <w:t xml:space="preserve">, 3D model, </w:t>
+      </w:r>
+      <w:proofErr w:type="spellStart"/>
+      <w:r>
+        <w:t>dem</w:t>
+      </w:r>
+      <w:proofErr w:type="spellEnd"/>
+      <w:r>
+        <w:t xml:space="preserve">, contour and point cloud as per need. The output of the models were below in the form of </w:t>
+      </w:r>
+      <w:proofErr w:type="spellStart"/>
+      <w:r>
+        <w:t>glb</w:t>
+      </w:r>
+      <w:proofErr w:type="spellEnd"/>
+      <w:r>
+        <w:t xml:space="preserve">/ </w:t>
+      </w:r>
+      <w:proofErr w:type="spellStart"/>
+      <w:r>
+        <w:t>gltf</w:t>
+      </w:r>
+      <w:proofErr w:type="spellEnd"/>
+      <w:r>
+        <w:t xml:space="preserve"> format (which you have to keep a button named as view model that shows the model I have prepared.)</w:t>
+      </w:r>
+    </w:p>
+    <w:p>
+      <w:r>
+        <w:t xml:space="preserve">I have handled the data processing for the </w:t>
+      </w:r>
+      <w:proofErr w:type="spellStart"/>
+      <w:r>
+        <w:t>orthomosaic</w:t>
+      </w:r>
+      <w:proofErr w:type="spellEnd"/>
+      <w:r>
+        <w:t xml:space="preserve"> for the </w:t>
+      </w:r>
+      <w:proofErr w:type="spellStart"/>
+      <w:r>
+        <w:t>Lalitpur</w:t>
+      </w:r>
+      <w:proofErr w:type="spellEnd"/>
+      <w:r>
+        <w:t xml:space="preserve"> </w:t>
+      </w:r>
+      <w:proofErr w:type="spellStart"/>
+      <w:r>
+        <w:t>Metropolitian</w:t>
+      </w:r>
+      <w:proofErr w:type="spellEnd"/>
+      <w:r>
+        <w:t xml:space="preserve"> City (LMC) with the </w:t>
+      </w:r>
+      <w:proofErr w:type="spellStart"/>
+      <w:r>
+        <w:t>gsd</w:t>
+      </w:r>
+      <w:proofErr w:type="spellEnd"/>
+      <w:r>
+        <w:t xml:space="preserve"> of 3 cm/pixel. The process includes the creation of the </w:t>
+      </w:r>
+      <w:proofErr w:type="spellStart"/>
+      <w:r>
+        <w:t>orthomosaic</w:t>
+      </w:r>
+      <w:proofErr w:type="spellEnd"/>
+      <w:r>
+        <w:t xml:space="preserve">, contour, </w:t>
+      </w:r>
+      <w:proofErr w:type="spellStart"/>
+      <w:r>
+        <w:t>dem</w:t>
+      </w:r>
+      <w:proofErr w:type="spellEnd"/>
+      <w:r>
+        <w:t xml:space="preserve"> and </w:t>
+      </w:r>
+      <w:proofErr w:type="spellStart"/>
+      <w:r>
+        <w:t>pointcloud</w:t>
+      </w:r>
+      <w:proofErr w:type="spellEnd"/>
+      <w:r>
+        <w:t xml:space="preserve">. </w:t>
+      </w:r>
+    </w:p>
+    <w:p/>
+    <w:p>
+      <w:r>
+        <w:br w:type="page"/>
+      </w:r>
+    </w:p>
+    <w:p>
+      <w:r>
+        <w:lastRenderedPageBreak/>
+        <w:t xml:space="preserve">Airlift </w:t>
+      </w:r>
+      <w:proofErr w:type="spellStart"/>
+      <w:proofErr w:type="gramStart"/>
+      <w:r>
+        <w:t>kailas</w:t>
+      </w:r>
+      <w:proofErr w:type="spellEnd"/>
+      <w:proofErr w:type="gramEnd"/>
+      <w:r>
+        <w:t xml:space="preserve"> </w:t>
+      </w:r>
+      <w:proofErr w:type="spellStart"/>
+      <w:r>
+        <w:t>Manaslu</w:t>
+      </w:r>
+      <w:proofErr w:type="spellEnd"/>
+      <w:r>
+        <w:t xml:space="preserve"> Cleanup Campaign</w:t>
+      </w:r>
+      <w:r>
+        <w:t>, 2025</w:t>
+      </w:r>
+    </w:p>
+    <w:p>
+      <w:pPr>
+        <w:pStyle w:val="Default"/>
+        <w:rPr>
+          <w:sz w:val="23"/>
+          <w:szCs w:val="23"/>
+        </w:rPr>
+      </w:pPr>
+      <w:r>
+        <w:t xml:space="preserve">Objective: </w:t>
+      </w:r>
+      <w:r>
+        <w:rPr>
+          <w:sz w:val="23"/>
+          <w:szCs w:val="23"/>
+        </w:rPr>
+        <w:t xml:space="preserve">The primary objective for the project was to test the drone delivery operation at Mt. </w:t>
+      </w:r>
+      <w:proofErr w:type="spellStart"/>
+      <w:r>
+        <w:rPr>
+          <w:sz w:val="23"/>
+          <w:szCs w:val="23"/>
+        </w:rPr>
+        <w:t>Manaslu</w:t>
+      </w:r>
+      <w:proofErr w:type="spellEnd"/>
+      <w:r>
+        <w:rPr>
+          <w:sz w:val="23"/>
+          <w:szCs w:val="23"/>
+        </w:rPr>
+        <w:t xml:space="preserve"> using Fly Cart 30 , between Base Camp and Camp 1, creating a route for the full pace operation from next season that includes the mapping of the glacier and periphery of Base Camp including </w:t>
+      </w:r>
+      <w:proofErr w:type="spellStart"/>
+      <w:r>
+        <w:rPr>
+          <w:sz w:val="23"/>
+          <w:szCs w:val="23"/>
+        </w:rPr>
+        <w:t>Birendra</w:t>
+      </w:r>
+      <w:proofErr w:type="spellEnd"/>
+      <w:r>
+        <w:rPr>
+          <w:sz w:val="23"/>
+          <w:szCs w:val="23"/>
+        </w:rPr>
+        <w:t xml:space="preserve"> Lake. </w:t>
+      </w:r>
+    </w:p>
+    <w:p>
+      <w:pPr>
+        <w:pStyle w:val="Default"/>
+        <w:rPr>
+          <w:sz w:val="23"/>
+          <w:szCs w:val="23"/>
+        </w:rPr>
+      </w:pPr>
+      <w:r>
+        <w:rPr>
+          <w:sz w:val="23"/>
+          <w:szCs w:val="23"/>
+        </w:rPr>
+        <w:t xml:space="preserve">The secondary objectives were: </w:t>
+      </w:r>
+    </w:p>
+    <w:p>
+      <w:pPr>
+        <w:pStyle w:val="Default"/>
+        <w:spacing w:after="9"/>
+        <w:rPr>
+          <w:sz w:val="23"/>
+          <w:szCs w:val="23"/>
+        </w:rPr>
+      </w:pPr>
+      <w:r>
+        <w:rPr>
+          <w:rFonts w:ascii="Wingdings" w:hAnsi="Wingdings" w:cs="Wingdings"/>
+          <w:sz w:val="23"/>
+          <w:szCs w:val="23"/>
+        </w:rPr>
+        <w:t></w:t>
+      </w:r>
+      <w:r>
+        <w:rPr>
+          <w:rFonts w:ascii="Wingdings" w:hAnsi="Wingdings" w:cs="Wingdings"/>
+          <w:sz w:val="23"/>
+          <w:szCs w:val="23"/>
+        </w:rPr>
+        <w:t></w:t>
+      </w:r>
+      <w:r>
+        <w:rPr>
+          <w:sz w:val="23"/>
+          <w:szCs w:val="23"/>
+        </w:rPr>
+        <w:t xml:space="preserve">To Map Apple Farm at </w:t>
+      </w:r>
+      <w:proofErr w:type="spellStart"/>
+      <w:r>
+        <w:rPr>
+          <w:sz w:val="23"/>
+          <w:szCs w:val="23"/>
+        </w:rPr>
+        <w:t>Namrung</w:t>
+      </w:r>
+      <w:proofErr w:type="spellEnd"/>
+      <w:r>
+        <w:rPr>
+          <w:sz w:val="23"/>
+          <w:szCs w:val="23"/>
+        </w:rPr>
+        <w:t xml:space="preserve"> and </w:t>
+      </w:r>
+      <w:proofErr w:type="spellStart"/>
+      <w:r>
+        <w:rPr>
+          <w:sz w:val="23"/>
+          <w:szCs w:val="23"/>
+        </w:rPr>
+        <w:t>Lho</w:t>
+      </w:r>
+      <w:proofErr w:type="spellEnd"/>
+      <w:r>
+        <w:rPr>
+          <w:sz w:val="23"/>
+          <w:szCs w:val="23"/>
+        </w:rPr>
+        <w:t xml:space="preserve"> with </w:t>
+      </w:r>
+      <w:proofErr w:type="spellStart"/>
+      <w:r>
+        <w:rPr>
+          <w:sz w:val="23"/>
+          <w:szCs w:val="23"/>
+        </w:rPr>
+        <w:t>feasilibilty</w:t>
+      </w:r>
+      <w:proofErr w:type="spellEnd"/>
+      <w:r>
+        <w:rPr>
+          <w:sz w:val="23"/>
+          <w:szCs w:val="23"/>
+        </w:rPr>
+        <w:t xml:space="preserve"> study for apple delivery using drones. </w:t>
+      </w:r>
+    </w:p>
+    <w:p>
+      <w:pPr>
+        <w:pStyle w:val="Default"/>
+        <w:spacing w:after="9"/>
+        <w:rPr>
+          <w:sz w:val="23"/>
+          <w:szCs w:val="23"/>
+        </w:rPr>
+      </w:pPr>
+      <w:r>
+        <w:rPr>
+          <w:rFonts w:ascii="Wingdings" w:hAnsi="Wingdings" w:cs="Wingdings"/>
+          <w:sz w:val="23"/>
+          <w:szCs w:val="23"/>
+        </w:rPr>
+        <w:t></w:t>
+      </w:r>
+      <w:r>
+        <w:rPr>
+          <w:rFonts w:ascii="Wingdings" w:hAnsi="Wingdings" w:cs="Wingdings"/>
+          <w:sz w:val="23"/>
+          <w:szCs w:val="23"/>
+        </w:rPr>
+        <w:t></w:t>
+      </w:r>
+      <w:r>
+        <w:rPr>
+          <w:sz w:val="23"/>
+          <w:szCs w:val="23"/>
+        </w:rPr>
+        <w:t xml:space="preserve">To study the weather, geographical and social understanding of the region. </w:t>
+      </w:r>
+    </w:p>
+    <w:p>
+      <w:pPr>
+        <w:pStyle w:val="Default"/>
+        <w:rPr>
+          <w:sz w:val="23"/>
+          <w:szCs w:val="23"/>
+        </w:rPr>
+      </w:pPr>
+      <w:r>
+        <w:rPr>
+          <w:rFonts w:ascii="Wingdings" w:hAnsi="Wingdings" w:cs="Wingdings"/>
+          <w:sz w:val="23"/>
+          <w:szCs w:val="23"/>
+        </w:rPr>
+        <w:t></w:t>
+      </w:r>
+      <w:r>
+        <w:rPr>
+          <w:rFonts w:ascii="Wingdings" w:hAnsi="Wingdings" w:cs="Wingdings"/>
+          <w:sz w:val="23"/>
+          <w:szCs w:val="23"/>
+        </w:rPr>
+        <w:t></w:t>
+      </w:r>
+      <w:r>
+        <w:rPr>
+          <w:sz w:val="23"/>
+          <w:szCs w:val="23"/>
+        </w:rPr>
+        <w:t xml:space="preserve">To interact with the </w:t>
+      </w:r>
+      <w:proofErr w:type="spellStart"/>
+      <w:r>
+        <w:rPr>
+          <w:sz w:val="23"/>
+          <w:szCs w:val="23"/>
+        </w:rPr>
+        <w:t>Sherpas</w:t>
+      </w:r>
+      <w:proofErr w:type="spellEnd"/>
+      <w:r>
+        <w:rPr>
+          <w:sz w:val="23"/>
+          <w:szCs w:val="23"/>
+        </w:rPr>
+        <w:t xml:space="preserve"> on understanding the changes on the </w:t>
+      </w:r>
+    </w:p>
+    <w:p>
+      <w:pPr>
+        <w:pStyle w:val="Default"/>
+        <w:rPr>
+          <w:sz w:val="23"/>
+          <w:szCs w:val="23"/>
+        </w:rPr>
+      </w:pPr>
+    </w:p>
+    <w:p>
+      <w:pPr>
+        <w:pStyle w:val="Default"/>
+        <w:rPr>
+          <w:sz w:val="23"/>
+          <w:szCs w:val="23"/>
+        </w:rPr>
+      </w:pPr>
+      <w:proofErr w:type="gramStart"/>
+      <w:r>
+        <w:rPr>
+          <w:sz w:val="23"/>
+          <w:szCs w:val="23"/>
+        </w:rPr>
+        <w:t>mountain</w:t>
+      </w:r>
+      <w:proofErr w:type="gramEnd"/>
+      <w:r>
+        <w:rPr>
+          <w:sz w:val="23"/>
+          <w:szCs w:val="23"/>
+        </w:rPr>
+        <w:t xml:space="preserve"> in few years due to climate change. </w:t>
+      </w:r>
+    </w:p>
+    <w:p>
+      <w:pPr>
+        <w:pStyle w:val="Default"/>
+        <w:rPr>
+          <w:sz w:val="32"/>
+          <w:szCs w:val="32"/>
+        </w:rPr>
+      </w:pPr>
+      <w:r>
+        <w:rPr>
+          <w:b/>
+          <w:bCs/>
+          <w:sz w:val="32"/>
+          <w:szCs w:val="32"/>
+        </w:rPr>
+        <w:t xml:space="preserve">Scopes </w:t>
+      </w:r>
+    </w:p>
+    <w:p>
+      <w:pPr>
+        <w:pStyle w:val="Default"/>
+        <w:spacing w:after="9"/>
+        <w:rPr>
+          <w:sz w:val="23"/>
+          <w:szCs w:val="23"/>
+        </w:rPr>
+      </w:pPr>
+      <w:r>
+        <w:rPr>
+          <w:rFonts w:ascii="Wingdings" w:hAnsi="Wingdings" w:cs="Wingdings"/>
+          <w:sz w:val="23"/>
+          <w:szCs w:val="23"/>
+        </w:rPr>
+        <w:t></w:t>
+      </w:r>
+      <w:r>
+        <w:rPr>
+          <w:rFonts w:ascii="Wingdings" w:hAnsi="Wingdings" w:cs="Wingdings"/>
+          <w:sz w:val="23"/>
+          <w:szCs w:val="23"/>
+        </w:rPr>
+        <w:t></w:t>
+      </w:r>
+      <w:r>
+        <w:rPr>
+          <w:sz w:val="23"/>
+          <w:szCs w:val="23"/>
+        </w:rPr>
+        <w:t xml:space="preserve">The project aims to successfully carry the garbage from Camp1 to Base Camp of Mt. </w:t>
+      </w:r>
+      <w:proofErr w:type="spellStart"/>
+      <w:r>
+        <w:rPr>
+          <w:sz w:val="23"/>
+          <w:szCs w:val="23"/>
+        </w:rPr>
+        <w:t>Manaslu</w:t>
+      </w:r>
+      <w:proofErr w:type="spellEnd"/>
+      <w:r>
+        <w:rPr>
+          <w:sz w:val="23"/>
+          <w:szCs w:val="23"/>
+        </w:rPr>
+        <w:t xml:space="preserve">. </w:t>
+      </w:r>
+    </w:p>
+    <w:p>
+      <w:pPr>
+        <w:pStyle w:val="Default"/>
+        <w:rPr>
+          <w:sz w:val="23"/>
+          <w:szCs w:val="23"/>
+        </w:rPr>
+      </w:pPr>
+      <w:r>
+        <w:rPr>
+          <w:rFonts w:ascii="Wingdings" w:hAnsi="Wingdings" w:cs="Wingdings"/>
+          <w:sz w:val="23"/>
+          <w:szCs w:val="23"/>
+        </w:rPr>
+        <w:t></w:t>
+      </w:r>
+      <w:r>
+        <w:rPr>
+          <w:rFonts w:ascii="Wingdings" w:hAnsi="Wingdings" w:cs="Wingdings"/>
+          <w:sz w:val="23"/>
+          <w:szCs w:val="23"/>
+        </w:rPr>
+        <w:t></w:t>
+      </w:r>
+      <w:r>
+        <w:rPr>
+          <w:sz w:val="23"/>
+          <w:szCs w:val="23"/>
+        </w:rPr>
+        <w:t xml:space="preserve">The mapping of Base Camp, Glaciers, </w:t>
+      </w:r>
+      <w:proofErr w:type="spellStart"/>
+      <w:r>
+        <w:rPr>
+          <w:sz w:val="23"/>
+          <w:szCs w:val="23"/>
+        </w:rPr>
+        <w:t>Birendra</w:t>
+      </w:r>
+      <w:proofErr w:type="spellEnd"/>
+      <w:r>
+        <w:rPr>
+          <w:sz w:val="23"/>
+          <w:szCs w:val="23"/>
+        </w:rPr>
+        <w:t xml:space="preserve"> </w:t>
+      </w:r>
+      <w:proofErr w:type="gramStart"/>
+      <w:r>
+        <w:rPr>
+          <w:sz w:val="23"/>
+          <w:szCs w:val="23"/>
+        </w:rPr>
+        <w:t>lake</w:t>
+      </w:r>
+      <w:proofErr w:type="gramEnd"/>
+      <w:r>
+        <w:rPr>
+          <w:sz w:val="23"/>
+          <w:szCs w:val="23"/>
+        </w:rPr>
+        <w:t xml:space="preserve">, trekking trail to basecamp and </w:t>
+      </w:r>
+      <w:proofErr w:type="spellStart"/>
+      <w:r>
+        <w:rPr>
+          <w:sz w:val="23"/>
+          <w:szCs w:val="23"/>
+        </w:rPr>
+        <w:t>Samagaun</w:t>
+      </w:r>
+      <w:proofErr w:type="spellEnd"/>
+      <w:r>
+        <w:rPr>
+          <w:sz w:val="23"/>
+          <w:szCs w:val="23"/>
+        </w:rPr>
+        <w:t xml:space="preserve"> for </w:t>
+      </w:r>
+      <w:proofErr w:type="spellStart"/>
+      <w:r>
+        <w:rPr>
+          <w:sz w:val="23"/>
+          <w:szCs w:val="23"/>
+        </w:rPr>
+        <w:t>Orthomosiac</w:t>
+      </w:r>
+      <w:proofErr w:type="spellEnd"/>
+      <w:r>
+        <w:rPr>
+          <w:sz w:val="23"/>
+          <w:szCs w:val="23"/>
+        </w:rPr>
+        <w:t xml:space="preserve"> creation and 3D model generation </w:t>
+      </w:r>
+    </w:p>
+    <w:p>
+      <w:pPr>
+        <w:sectPr>
+          <w:pgSz w:w="11906" w:h="17338"/>
+          <w:pgMar w:top="1834" w:right="855" w:bottom="1392" w:left="1139" w:header="720" w:footer="720" w:gutter="0"/>
+          <w:cols w:space="720"/>
+          <w:noEndnote/>
+        </w:sectPr>
+      </w:pPr>
+    </w:p>
+    <w:p>
+      <w:pPr>
+        <w:pStyle w:val="Default"/>
+        <w:rPr>
+          <w:b/>
+          <w:color w:val="auto"/>
+          <w:sz w:val="23"/>
+          <w:szCs w:val="23"/>
+        </w:rPr>
+      </w:pPr>
+      <w:r>
+        <w:rPr>
+          <w:b/>
+          <w:color w:val="auto"/>
+          <w:sz w:val="23"/>
+          <w:szCs w:val="23"/>
+        </w:rPr>
+        <w:lastRenderedPageBreak/>
+        <w:t>Introduction</w:t>
+      </w:r>
+    </w:p>
+    <w:p>
+      <w:pPr>
+        <w:pStyle w:val="Default"/>
+        <w:rPr>
+          <w:color w:val="auto"/>
+          <w:sz w:val="23"/>
+          <w:szCs w:val="23"/>
+        </w:rPr>
+      </w:pPr>
+      <w:r>
+        <w:rPr>
+          <w:color w:val="auto"/>
+          <w:sz w:val="23"/>
+          <w:szCs w:val="23"/>
+        </w:rPr>
+        <w:t xml:space="preserve">Mount </w:t>
+      </w:r>
+      <w:proofErr w:type="spellStart"/>
+      <w:r>
+        <w:rPr>
+          <w:color w:val="auto"/>
+          <w:sz w:val="23"/>
+          <w:szCs w:val="23"/>
+        </w:rPr>
+        <w:t>Manaslu</w:t>
+      </w:r>
+      <w:proofErr w:type="spellEnd"/>
+      <w:r>
+        <w:rPr>
+          <w:color w:val="auto"/>
+          <w:sz w:val="23"/>
+          <w:szCs w:val="23"/>
+        </w:rPr>
+        <w:t xml:space="preserve"> is the Eight Height Peaks of world with an elevation of 26,781ft (8163m) above the sea level. Mt. </w:t>
+      </w:r>
+      <w:proofErr w:type="spellStart"/>
+      <w:r>
+        <w:rPr>
+          <w:color w:val="auto"/>
+          <w:sz w:val="23"/>
+          <w:szCs w:val="23"/>
+        </w:rPr>
+        <w:t>Manaslu</w:t>
+      </w:r>
+      <w:proofErr w:type="spellEnd"/>
+      <w:r>
+        <w:rPr>
+          <w:color w:val="auto"/>
+          <w:sz w:val="23"/>
+          <w:szCs w:val="23"/>
+        </w:rPr>
+        <w:t xml:space="preserve"> lies in </w:t>
+      </w:r>
+      <w:r>
+        <w:rPr>
+          <w:i/>
+          <w:iCs/>
+          <w:color w:val="auto"/>
+          <w:sz w:val="23"/>
+          <w:szCs w:val="23"/>
+        </w:rPr>
+        <w:t>‘</w:t>
+      </w:r>
+      <w:proofErr w:type="spellStart"/>
+      <w:r>
+        <w:rPr>
+          <w:i/>
+          <w:iCs/>
+          <w:color w:val="auto"/>
+          <w:sz w:val="23"/>
+          <w:szCs w:val="23"/>
+        </w:rPr>
+        <w:t>Mansiri</w:t>
+      </w:r>
+      <w:proofErr w:type="spellEnd"/>
+      <w:r>
+        <w:rPr>
+          <w:i/>
+          <w:iCs/>
+          <w:color w:val="auto"/>
+          <w:sz w:val="23"/>
+          <w:szCs w:val="23"/>
+        </w:rPr>
+        <w:t xml:space="preserve"> </w:t>
+      </w:r>
+      <w:proofErr w:type="spellStart"/>
+      <w:r>
+        <w:rPr>
+          <w:i/>
+          <w:iCs/>
+          <w:color w:val="auto"/>
+          <w:sz w:val="23"/>
+          <w:szCs w:val="23"/>
+        </w:rPr>
+        <w:t>Himal</w:t>
+      </w:r>
+      <w:proofErr w:type="spellEnd"/>
+      <w:r>
+        <w:rPr>
+          <w:i/>
+          <w:iCs/>
+          <w:color w:val="auto"/>
+          <w:sz w:val="23"/>
+          <w:szCs w:val="23"/>
+        </w:rPr>
+        <w:t xml:space="preserve"> Range’ </w:t>
+      </w:r>
+      <w:r>
+        <w:rPr>
+          <w:color w:val="auto"/>
+          <w:sz w:val="23"/>
+          <w:szCs w:val="23"/>
+        </w:rPr>
+        <w:t xml:space="preserve">on the west central Nepal, specifically in </w:t>
+      </w:r>
+      <w:proofErr w:type="spellStart"/>
+      <w:r>
+        <w:rPr>
+          <w:color w:val="auto"/>
+          <w:sz w:val="23"/>
+          <w:szCs w:val="23"/>
+        </w:rPr>
+        <w:t>Gorkha</w:t>
+      </w:r>
+      <w:proofErr w:type="spellEnd"/>
+      <w:r>
+        <w:rPr>
+          <w:color w:val="auto"/>
+          <w:sz w:val="23"/>
+          <w:szCs w:val="23"/>
+        </w:rPr>
+        <w:t xml:space="preserve"> and </w:t>
+      </w:r>
+      <w:proofErr w:type="spellStart"/>
+      <w:r>
+        <w:rPr>
+          <w:color w:val="auto"/>
+          <w:sz w:val="23"/>
+          <w:szCs w:val="23"/>
+        </w:rPr>
+        <w:t>Manang</w:t>
+      </w:r>
+      <w:proofErr w:type="spellEnd"/>
+      <w:r>
+        <w:rPr>
+          <w:color w:val="auto"/>
+          <w:sz w:val="23"/>
+          <w:szCs w:val="23"/>
+        </w:rPr>
+        <w:t xml:space="preserve"> District. The name of the mountain is derived from the </w:t>
+      </w:r>
+      <w:r>
+        <w:rPr>
+          <w:i/>
+          <w:iCs/>
+          <w:color w:val="auto"/>
+          <w:sz w:val="23"/>
+          <w:szCs w:val="23"/>
+        </w:rPr>
+        <w:t xml:space="preserve">Sanskrit </w:t>
+      </w:r>
+      <w:r>
+        <w:rPr>
+          <w:color w:val="auto"/>
+          <w:sz w:val="23"/>
+          <w:szCs w:val="23"/>
+        </w:rPr>
+        <w:t xml:space="preserve">word, </w:t>
+      </w:r>
+      <w:r>
+        <w:rPr>
+          <w:i/>
+          <w:iCs/>
+          <w:color w:val="auto"/>
+          <w:sz w:val="23"/>
+          <w:szCs w:val="23"/>
+        </w:rPr>
+        <w:t>‘</w:t>
+      </w:r>
+      <w:proofErr w:type="spellStart"/>
+      <w:r>
+        <w:rPr>
+          <w:i/>
+          <w:iCs/>
+          <w:color w:val="auto"/>
+          <w:sz w:val="23"/>
+          <w:szCs w:val="23"/>
+        </w:rPr>
+        <w:t>Mansara</w:t>
+      </w:r>
+      <w:proofErr w:type="spellEnd"/>
+      <w:r>
+        <w:rPr>
+          <w:i/>
+          <w:iCs/>
+          <w:color w:val="auto"/>
+          <w:sz w:val="23"/>
+          <w:szCs w:val="23"/>
+        </w:rPr>
+        <w:t xml:space="preserve">’ </w:t>
+      </w:r>
+      <w:r>
+        <w:rPr>
+          <w:color w:val="auto"/>
+          <w:sz w:val="23"/>
+          <w:szCs w:val="23"/>
+        </w:rPr>
+        <w:t xml:space="preserve">whose meaning is ‘Mountain of Spirit’ or ‘intellect/soul’. It was formed by the collision of Indian and Eurasian Tectonic Plated around 50 million years ago. </w:t>
+      </w:r>
+    </w:p>
+    <w:p>
+      <w:pPr>
+        <w:pStyle w:val="Default"/>
+        <w:rPr>
+          <w:color w:val="auto"/>
+          <w:sz w:val="23"/>
+          <w:szCs w:val="23"/>
+        </w:rPr>
+      </w:pPr>
+      <w:r>
+        <w:rPr>
+          <w:color w:val="auto"/>
+          <w:sz w:val="23"/>
+          <w:szCs w:val="23"/>
+        </w:rPr>
+        <w:t xml:space="preserve">Mt. </w:t>
+      </w:r>
+      <w:proofErr w:type="spellStart"/>
+      <w:r>
+        <w:rPr>
+          <w:color w:val="auto"/>
+          <w:sz w:val="23"/>
+          <w:szCs w:val="23"/>
+        </w:rPr>
+        <w:t>Manaslu</w:t>
+      </w:r>
+      <w:proofErr w:type="spellEnd"/>
+      <w:r>
+        <w:rPr>
+          <w:color w:val="auto"/>
+          <w:sz w:val="23"/>
+          <w:szCs w:val="23"/>
+        </w:rPr>
+        <w:t xml:space="preserve"> is located in Chum </w:t>
+      </w:r>
+      <w:proofErr w:type="spellStart"/>
+      <w:r>
+        <w:rPr>
+          <w:color w:val="auto"/>
+          <w:sz w:val="23"/>
+          <w:szCs w:val="23"/>
+        </w:rPr>
+        <w:t>Nubri</w:t>
+      </w:r>
+      <w:proofErr w:type="spellEnd"/>
+      <w:r>
+        <w:rPr>
+          <w:color w:val="auto"/>
+          <w:sz w:val="23"/>
+          <w:szCs w:val="23"/>
+        </w:rPr>
+        <w:t xml:space="preserve"> Rural Municipality of </w:t>
+      </w:r>
+      <w:proofErr w:type="spellStart"/>
+      <w:r>
+        <w:rPr>
+          <w:color w:val="auto"/>
+          <w:sz w:val="23"/>
+          <w:szCs w:val="23"/>
+        </w:rPr>
+        <w:t>Gorkha</w:t>
+      </w:r>
+      <w:proofErr w:type="spellEnd"/>
+      <w:r>
+        <w:rPr>
+          <w:color w:val="auto"/>
+          <w:sz w:val="23"/>
+          <w:szCs w:val="23"/>
+        </w:rPr>
+        <w:t xml:space="preserve"> district. For the conservation of the mountain and its nature, </w:t>
+      </w:r>
+      <w:proofErr w:type="spellStart"/>
+      <w:r>
+        <w:rPr>
+          <w:color w:val="auto"/>
+          <w:sz w:val="23"/>
+          <w:szCs w:val="23"/>
+        </w:rPr>
+        <w:t>Manaslu</w:t>
+      </w:r>
+      <w:proofErr w:type="spellEnd"/>
+      <w:r>
+        <w:rPr>
+          <w:color w:val="auto"/>
+          <w:sz w:val="23"/>
+          <w:szCs w:val="23"/>
+        </w:rPr>
+        <w:t xml:space="preserve"> Conservation Area Project (MCAP) was established in 28</w:t>
+      </w:r>
+      <w:r>
+        <w:rPr>
+          <w:color w:val="auto"/>
+          <w:sz w:val="16"/>
+          <w:szCs w:val="16"/>
+        </w:rPr>
+        <w:t xml:space="preserve">th </w:t>
+      </w:r>
+      <w:r>
+        <w:rPr>
+          <w:color w:val="auto"/>
+          <w:sz w:val="23"/>
+          <w:szCs w:val="23"/>
+        </w:rPr>
+        <w:t xml:space="preserve">Dec, 1998 covering an area of 1,663 sq. km. It is managed by </w:t>
+      </w:r>
+      <w:r>
+        <w:rPr>
+          <w:i/>
+          <w:iCs/>
+          <w:color w:val="auto"/>
+          <w:sz w:val="23"/>
+          <w:szCs w:val="23"/>
+        </w:rPr>
+        <w:t xml:space="preserve">National Trust for Nature Conservation </w:t>
+      </w:r>
+      <w:r>
+        <w:rPr>
+          <w:color w:val="auto"/>
+          <w:sz w:val="23"/>
+          <w:szCs w:val="23"/>
+        </w:rPr>
+        <w:t xml:space="preserve">(NTNC). MCAP encompasses an extreme altitudinal climatic range from Sub-tropical (low valley) to Artic </w:t>
+      </w:r>
+      <w:proofErr w:type="spellStart"/>
+      <w:r>
+        <w:rPr>
+          <w:color w:val="auto"/>
+          <w:sz w:val="23"/>
+          <w:szCs w:val="23"/>
+        </w:rPr>
+        <w:t>Nival</w:t>
+      </w:r>
+      <w:proofErr w:type="spellEnd"/>
+      <w:r>
+        <w:rPr>
+          <w:color w:val="auto"/>
+          <w:sz w:val="23"/>
+          <w:szCs w:val="23"/>
+        </w:rPr>
+        <w:t xml:space="preserve"> (above 4,500m). </w:t>
+      </w:r>
+    </w:p>
+    <w:p>
+      <w:pPr>
+        <w:pStyle w:val="Default"/>
+        <w:rPr>
+          <w:color w:val="auto"/>
+          <w:sz w:val="23"/>
+          <w:szCs w:val="23"/>
+        </w:rPr>
+      </w:pPr>
+      <w:r>
+        <w:rPr>
+          <w:color w:val="auto"/>
+          <w:sz w:val="23"/>
+          <w:szCs w:val="23"/>
+        </w:rPr>
+        <w:t xml:space="preserve">The Mountain was firstly summited by </w:t>
+      </w:r>
+      <w:r>
+        <w:rPr>
+          <w:i/>
+          <w:iCs/>
+          <w:color w:val="auto"/>
+          <w:sz w:val="23"/>
+          <w:szCs w:val="23"/>
+        </w:rPr>
+        <w:t xml:space="preserve">Toshio </w:t>
+      </w:r>
+      <w:proofErr w:type="spellStart"/>
+      <w:r>
+        <w:rPr>
+          <w:i/>
+          <w:iCs/>
+          <w:color w:val="auto"/>
+          <w:sz w:val="23"/>
+          <w:szCs w:val="23"/>
+        </w:rPr>
+        <w:t>Imanishi</w:t>
+      </w:r>
+      <w:proofErr w:type="spellEnd"/>
+      <w:r>
+        <w:rPr>
+          <w:i/>
+          <w:iCs/>
+          <w:color w:val="auto"/>
+          <w:sz w:val="23"/>
+          <w:szCs w:val="23"/>
+        </w:rPr>
+        <w:t xml:space="preserve"> </w:t>
+      </w:r>
+      <w:r>
+        <w:rPr>
+          <w:color w:val="auto"/>
+          <w:sz w:val="23"/>
+          <w:szCs w:val="23"/>
+        </w:rPr>
+        <w:t xml:space="preserve">and </w:t>
+      </w:r>
+      <w:proofErr w:type="spellStart"/>
+      <w:r>
+        <w:rPr>
+          <w:i/>
+          <w:iCs/>
+          <w:color w:val="auto"/>
+          <w:sz w:val="23"/>
+          <w:szCs w:val="23"/>
+        </w:rPr>
+        <w:t>Gyalzen</w:t>
+      </w:r>
+      <w:proofErr w:type="spellEnd"/>
+      <w:r>
+        <w:rPr>
+          <w:i/>
+          <w:iCs/>
+          <w:color w:val="auto"/>
+          <w:sz w:val="23"/>
+          <w:szCs w:val="23"/>
+        </w:rPr>
+        <w:t xml:space="preserve"> </w:t>
+      </w:r>
+      <w:proofErr w:type="spellStart"/>
+      <w:r>
+        <w:rPr>
+          <w:i/>
+          <w:iCs/>
+          <w:color w:val="auto"/>
+          <w:sz w:val="23"/>
+          <w:szCs w:val="23"/>
+        </w:rPr>
+        <w:t>Norbu</w:t>
+      </w:r>
+      <w:proofErr w:type="spellEnd"/>
+      <w:r>
+        <w:rPr>
+          <w:i/>
+          <w:iCs/>
+          <w:color w:val="auto"/>
+          <w:sz w:val="23"/>
+          <w:szCs w:val="23"/>
+        </w:rPr>
+        <w:t xml:space="preserve"> </w:t>
+      </w:r>
+      <w:r>
+        <w:rPr>
+          <w:color w:val="auto"/>
+          <w:sz w:val="23"/>
+          <w:szCs w:val="23"/>
+        </w:rPr>
+        <w:t>on 9</w:t>
+      </w:r>
+      <w:r>
+        <w:rPr>
+          <w:color w:val="auto"/>
+          <w:sz w:val="16"/>
+          <w:szCs w:val="16"/>
+        </w:rPr>
+        <w:t xml:space="preserve">th </w:t>
+      </w:r>
+      <w:r>
+        <w:rPr>
+          <w:color w:val="auto"/>
+          <w:sz w:val="23"/>
+          <w:szCs w:val="23"/>
+        </w:rPr>
+        <w:t>May, 1956</w:t>
+      </w:r>
+      <w:proofErr w:type="gramStart"/>
+      <w:r>
+        <w:rPr>
+          <w:color w:val="auto"/>
+          <w:sz w:val="23"/>
+          <w:szCs w:val="23"/>
+        </w:rPr>
+        <w:t>.[</w:t>
+      </w:r>
+      <w:proofErr w:type="gramEnd"/>
+      <w:r>
+        <w:rPr>
+          <w:i/>
+          <w:iCs/>
+          <w:color w:val="auto"/>
+          <w:sz w:val="20"/>
+          <w:szCs w:val="20"/>
+        </w:rPr>
+        <w:t>Japanese Alpine Club Record</w:t>
+      </w:r>
+      <w:r>
+        <w:rPr>
+          <w:i/>
+          <w:iCs/>
+          <w:color w:val="auto"/>
+          <w:sz w:val="23"/>
+          <w:szCs w:val="23"/>
+        </w:rPr>
+        <w:t xml:space="preserve">]. </w:t>
+      </w:r>
+      <w:r>
+        <w:rPr>
+          <w:color w:val="auto"/>
+          <w:sz w:val="23"/>
+          <w:szCs w:val="23"/>
+        </w:rPr>
+        <w:t xml:space="preserve">On 1972, an avalanche struck a Korean expedition’s camp, </w:t>
+      </w:r>
+      <w:proofErr w:type="spellStart"/>
+      <w:r>
+        <w:rPr>
+          <w:color w:val="auto"/>
+          <w:sz w:val="23"/>
+          <w:szCs w:val="23"/>
+        </w:rPr>
+        <w:t>resultin</w:t>
+      </w:r>
+      <w:proofErr w:type="spellEnd"/>
+      <w:r>
+        <w:rPr>
+          <w:color w:val="auto"/>
+          <w:sz w:val="23"/>
+          <w:szCs w:val="23"/>
+        </w:rPr>
+        <w:t xml:space="preserve"> in 15 deaths</w:t>
+      </w:r>
+      <w:proofErr w:type="gramStart"/>
+      <w:r>
+        <w:rPr>
+          <w:color w:val="auto"/>
+          <w:sz w:val="23"/>
+          <w:szCs w:val="23"/>
+        </w:rPr>
+        <w:t>.[</w:t>
+      </w:r>
+      <w:proofErr w:type="gramEnd"/>
+      <w:r>
+        <w:rPr>
+          <w:i/>
+          <w:iCs/>
+          <w:color w:val="auto"/>
+          <w:sz w:val="20"/>
+          <w:szCs w:val="20"/>
+        </w:rPr>
+        <w:t>Alpine Journal</w:t>
+      </w:r>
+      <w:r>
+        <w:rPr>
+          <w:color w:val="auto"/>
+          <w:sz w:val="23"/>
+          <w:szCs w:val="23"/>
+        </w:rPr>
+        <w:t xml:space="preserve">] </w:t>
+      </w:r>
+    </w:p>
+    <w:p>
+      <w:pPr>
+        <w:pStyle w:val="Default"/>
+        <w:rPr>
+          <w:color w:val="auto"/>
+          <w:sz w:val="23"/>
+          <w:szCs w:val="23"/>
+        </w:rPr>
+      </w:pPr>
+      <w:r>
+        <w:rPr>
+          <w:color w:val="auto"/>
+          <w:sz w:val="23"/>
+          <w:szCs w:val="23"/>
+        </w:rPr>
+        <w:t xml:space="preserve">Due to the historical fatality rate, primarily driven by avalanches and difficult weather, Mt. </w:t>
+      </w:r>
+      <w:proofErr w:type="spellStart"/>
+      <w:r>
+        <w:rPr>
+          <w:color w:val="auto"/>
+          <w:sz w:val="23"/>
+          <w:szCs w:val="23"/>
+        </w:rPr>
+        <w:t>Manaslu</w:t>
+      </w:r>
+      <w:proofErr w:type="spellEnd"/>
+      <w:r>
+        <w:rPr>
+          <w:color w:val="auto"/>
+          <w:sz w:val="23"/>
+          <w:szCs w:val="23"/>
+        </w:rPr>
+        <w:t xml:space="preserve"> has got the nickname of </w:t>
+      </w:r>
+      <w:r>
+        <w:rPr>
+          <w:i/>
+          <w:iCs/>
+          <w:color w:val="auto"/>
+          <w:sz w:val="23"/>
+          <w:szCs w:val="23"/>
+        </w:rPr>
+        <w:t xml:space="preserve">‘The Killer Mountain’. </w:t>
+      </w:r>
+      <w:r>
+        <w:rPr>
+          <w:color w:val="auto"/>
+          <w:sz w:val="23"/>
+          <w:szCs w:val="23"/>
+        </w:rPr>
+        <w:t>The fatality rate based on the data shows around 9 deaths per 100 successful summits. [</w:t>
+      </w:r>
+      <w:proofErr w:type="gramStart"/>
+      <w:r>
+        <w:rPr>
+          <w:i/>
+          <w:iCs/>
+          <w:color w:val="auto"/>
+          <w:sz w:val="20"/>
+          <w:szCs w:val="20"/>
+        </w:rPr>
+        <w:t>calculated</w:t>
+      </w:r>
+      <w:proofErr w:type="gramEnd"/>
+      <w:r>
+        <w:rPr>
+          <w:i/>
+          <w:iCs/>
+          <w:color w:val="auto"/>
+          <w:sz w:val="20"/>
+          <w:szCs w:val="20"/>
+        </w:rPr>
+        <w:t xml:space="preserve"> and tracked by The Himalayan Database</w:t>
+      </w:r>
+      <w:r>
+        <w:rPr>
+          <w:color w:val="auto"/>
+          <w:sz w:val="23"/>
+          <w:szCs w:val="23"/>
+        </w:rPr>
+        <w:t xml:space="preserve">]. </w:t>
+      </w:r>
+    </w:p>
+    <w:p>
+      <w:pPr>
+        <w:pStyle w:val="Default"/>
+        <w:rPr>
+          <w:color w:val="auto"/>
+          <w:sz w:val="23"/>
+          <w:szCs w:val="23"/>
+        </w:rPr>
+      </w:pPr>
+      <w:r>
+        <w:rPr>
+          <w:color w:val="auto"/>
+          <w:sz w:val="23"/>
+          <w:szCs w:val="23"/>
+        </w:rPr>
+        <w:t xml:space="preserve">During the 2025 season, a total of 374 permits were issued from the Department of Tourism (DoT). Every year the number of permits taken for summit has been increasing. This year two major record were made, Mt. </w:t>
+      </w:r>
+      <w:proofErr w:type="spellStart"/>
+      <w:r>
+        <w:rPr>
+          <w:color w:val="auto"/>
+          <w:sz w:val="23"/>
+          <w:szCs w:val="23"/>
+        </w:rPr>
+        <w:t>Manaslu</w:t>
+      </w:r>
+      <w:proofErr w:type="spellEnd"/>
+      <w:r>
+        <w:rPr>
+          <w:color w:val="auto"/>
+          <w:sz w:val="23"/>
+          <w:szCs w:val="23"/>
+        </w:rPr>
+        <w:t xml:space="preserve"> was summited by youngest person of 16 years, </w:t>
+      </w:r>
+      <w:proofErr w:type="spellStart"/>
+      <w:r>
+        <w:rPr>
+          <w:i/>
+          <w:iCs/>
+          <w:color w:val="auto"/>
+          <w:sz w:val="23"/>
+          <w:szCs w:val="23"/>
+        </w:rPr>
+        <w:t>Nima</w:t>
+      </w:r>
+      <w:proofErr w:type="spellEnd"/>
+      <w:r>
+        <w:rPr>
+          <w:i/>
+          <w:iCs/>
+          <w:color w:val="auto"/>
+          <w:sz w:val="23"/>
+          <w:szCs w:val="23"/>
+        </w:rPr>
+        <w:t xml:space="preserve"> </w:t>
+      </w:r>
+      <w:proofErr w:type="spellStart"/>
+      <w:r>
+        <w:rPr>
+          <w:i/>
+          <w:iCs/>
+          <w:color w:val="auto"/>
+          <w:sz w:val="23"/>
+          <w:szCs w:val="23"/>
+        </w:rPr>
+        <w:t>Chhiring</w:t>
+      </w:r>
+      <w:proofErr w:type="spellEnd"/>
+      <w:r>
+        <w:rPr>
+          <w:i/>
+          <w:iCs/>
+          <w:color w:val="auto"/>
+          <w:sz w:val="23"/>
+          <w:szCs w:val="23"/>
+        </w:rPr>
+        <w:t xml:space="preserve"> Sherpa </w:t>
+      </w:r>
+      <w:r>
+        <w:rPr>
+          <w:color w:val="auto"/>
+          <w:sz w:val="23"/>
+          <w:szCs w:val="23"/>
+        </w:rPr>
+        <w:t xml:space="preserve">from Nepal and the oldest person to summit, </w:t>
+      </w:r>
+      <w:r>
+        <w:rPr>
+          <w:i/>
+          <w:iCs/>
+          <w:color w:val="auto"/>
+          <w:sz w:val="23"/>
+          <w:szCs w:val="23"/>
+        </w:rPr>
+        <w:t>Carlos Soria</w:t>
+      </w:r>
+      <w:r>
+        <w:rPr>
+          <w:color w:val="auto"/>
+          <w:sz w:val="23"/>
+          <w:szCs w:val="23"/>
+        </w:rPr>
+        <w:t>, 86 years, making him the oldest mountaineer ever to conquer eight-</w:t>
+      </w:r>
+      <w:proofErr w:type="spellStart"/>
+      <w:r>
+        <w:rPr>
+          <w:color w:val="auto"/>
+          <w:sz w:val="23"/>
+          <w:szCs w:val="23"/>
+        </w:rPr>
+        <w:t>thousander</w:t>
+      </w:r>
+      <w:proofErr w:type="spellEnd"/>
+      <w:r>
+        <w:rPr>
+          <w:color w:val="auto"/>
+          <w:sz w:val="23"/>
+          <w:szCs w:val="23"/>
+        </w:rPr>
+        <w:t xml:space="preserve">. </w:t>
+      </w:r>
+    </w:p>
+    <w:p>
+      <w:pPr>
+        <w:pStyle w:val="Default"/>
+        <w:rPr>
+          <w:color w:val="auto"/>
+          <w:sz w:val="23"/>
+          <w:szCs w:val="23"/>
+        </w:rPr>
+      </w:pPr>
+      <w:r>
+        <w:rPr>
+          <w:color w:val="auto"/>
+          <w:sz w:val="23"/>
+          <w:szCs w:val="23"/>
+        </w:rPr>
+        <w:t xml:space="preserve">With the increase on the number of people to summit, a huge amount of waste is generated which is a big problem for the future of the mountain and the nature thereby. For the mountaineers, it is highly tiring and challenging job to carry out their waste during the summit and return them back to the waste management committee. </w:t>
+      </w:r>
+    </w:p>
+    <w:p>
+      <w:pPr>
+        <w:pStyle w:val="Default"/>
+        <w:rPr>
+          <w:color w:val="auto"/>
+          <w:sz w:val="23"/>
+          <w:szCs w:val="23"/>
+        </w:rPr>
+      </w:pPr>
+      <w:r>
+        <w:rPr>
+          <w:color w:val="auto"/>
+          <w:sz w:val="23"/>
+          <w:szCs w:val="23"/>
+        </w:rPr>
+        <w:t xml:space="preserve">Although there is presence of law and governing body, still the mountains are being polluted with lack of proper and efficient practice and plans. </w:t>
+      </w:r>
+    </w:p>
+    <w:p>
+      <w:pPr>
+        <w:pStyle w:val="Default"/>
+        <w:rPr>
+          <w:color w:val="auto"/>
+          <w:sz w:val="23"/>
+          <w:szCs w:val="23"/>
+        </w:rPr>
+      </w:pPr>
+      <w:r>
+        <w:rPr>
+          <w:color w:val="auto"/>
+          <w:sz w:val="23"/>
+          <w:szCs w:val="23"/>
+        </w:rPr>
+        <w:t xml:space="preserve">Airlift Technology, established on 2015, is a globally leading private organization rooted in Nepal. The organization has been operating in collecting garbage from higher camps to base camp and supplying necessary equipment, oxygen cylinders and ladders for the Mountaineers and Icefall Doctors. Airlift successfully completed two season on Mt. Everest (8848.86m) and one season on Mt, </w:t>
+      </w:r>
+      <w:proofErr w:type="spellStart"/>
+      <w:r>
+        <w:rPr>
+          <w:color w:val="auto"/>
+          <w:sz w:val="23"/>
+          <w:szCs w:val="23"/>
+        </w:rPr>
+        <w:t>Ama</w:t>
+      </w:r>
+      <w:proofErr w:type="spellEnd"/>
+      <w:r>
+        <w:rPr>
+          <w:color w:val="auto"/>
+          <w:sz w:val="23"/>
+          <w:szCs w:val="23"/>
+        </w:rPr>
+        <w:t xml:space="preserve"> </w:t>
+      </w:r>
+      <w:proofErr w:type="spellStart"/>
+      <w:r>
+        <w:rPr>
+          <w:color w:val="auto"/>
+          <w:sz w:val="23"/>
+          <w:szCs w:val="23"/>
+        </w:rPr>
+        <w:t>Dablam</w:t>
+      </w:r>
+      <w:proofErr w:type="spellEnd"/>
+      <w:r>
+        <w:rPr>
+          <w:color w:val="auto"/>
+          <w:sz w:val="23"/>
+          <w:szCs w:val="23"/>
+        </w:rPr>
+        <w:t xml:space="preserve"> (6812 m) making the record on performing the drone delivery at the highest altitude. </w:t>
+      </w:r>
+    </w:p>
+    <w:p>
+      <w:pPr>
+        <w:rPr>
+          <w:sz w:val="23"/>
+          <w:szCs w:val="23"/>
+        </w:rPr>
+      </w:pPr>
+      <w:r>
+        <w:rPr>
+          <w:sz w:val="23"/>
+          <w:szCs w:val="23"/>
+        </w:rPr>
+        <w:t xml:space="preserve">During the season of 2024, a total of 300 kg waste was collected from Camp 1 of Mt. Everest. At Mt. </w:t>
+      </w:r>
+      <w:proofErr w:type="spellStart"/>
+      <w:r>
+        <w:rPr>
+          <w:sz w:val="23"/>
+          <w:szCs w:val="23"/>
+        </w:rPr>
+        <w:t>Ama</w:t>
+      </w:r>
+      <w:proofErr w:type="spellEnd"/>
+      <w:r>
+        <w:rPr>
+          <w:sz w:val="23"/>
+          <w:szCs w:val="23"/>
+        </w:rPr>
+        <w:t xml:space="preserve"> </w:t>
+      </w:r>
+      <w:proofErr w:type="spellStart"/>
+      <w:r>
+        <w:rPr>
+          <w:sz w:val="23"/>
+          <w:szCs w:val="23"/>
+        </w:rPr>
+        <w:t>Dablam</w:t>
+      </w:r>
+      <w:proofErr w:type="spellEnd"/>
+      <w:r>
+        <w:rPr>
+          <w:sz w:val="23"/>
+          <w:szCs w:val="23"/>
+        </w:rPr>
+        <w:t xml:space="preserve"> the waste was collected from Camp1 and Camp2. The collected was were handed over to the waste management committee of the respective region. Airlift has been working as a mediator between the mountaineers and the waste management committee to keep the mountains clean and protect identity.</w:t>
+      </w:r>
+    </w:p>
+    <w:p>
+      <w:pPr>
+        <w:rPr>
+          <w:sz w:val="23"/>
+          <w:szCs w:val="23"/>
+        </w:rPr>
+      </w:pPr>
+      <w:r>
+        <w:rPr>
+          <w:sz w:val="23"/>
+          <w:szCs w:val="23"/>
+        </w:rPr>
+        <w:t>Total Days on the field is 24 days (4 Sept 2025 to 27 Sept, 2025).</w:t>
+      </w:r>
+    </w:p>
+    <w:p>
+      <w:pPr>
+        <w:rPr>
+          <w:sz w:val="23"/>
+          <w:szCs w:val="23"/>
+        </w:rPr>
+      </w:pPr>
+    </w:p>
+    <w:p>
+      <w:pPr>
+        <w:rPr>
+          <w:sz w:val="23"/>
+          <w:szCs w:val="23"/>
+        </w:rPr>
+      </w:pPr>
+    </w:p>
+    <w:p>
+      <w:pPr>
+        <w:rPr>
+          <w:sz w:val="23"/>
+          <w:szCs w:val="23"/>
+        </w:rPr>
+      </w:pPr>
+    </w:p>
+    <w:p>
+      <w:pPr>
+        <w:rPr>
+          <w:sz w:val="23"/>
+          <w:szCs w:val="23"/>
+        </w:rPr>
+      </w:pPr>
+    </w:p>
+    <w:p>
+      <w:pPr>
+        <w:rPr>
+          <w:sz w:val="23"/>
+          <w:szCs w:val="23"/>
+        </w:rPr>
+      </w:pPr>
+    </w:p>
+    <w:p>
+      <w:pPr>
+        <w:rPr>
+          <w:sz w:val="23"/>
+          <w:szCs w:val="23"/>
+        </w:rPr>
+      </w:pPr>
+    </w:p>
+    <w:p>
+      <w:pPr>
+        <w:pStyle w:val="Default"/>
+        <w:rPr>
+          <w:sz w:val="32"/>
+          <w:szCs w:val="32"/>
+        </w:rPr>
+      </w:pPr>
+      <w:r>
+        <w:rPr>
+          <w:b/>
+          <w:bCs/>
+          <w:sz w:val="32"/>
+          <w:szCs w:val="32"/>
+        </w:rPr>
+        <w:t xml:space="preserve">Result </w:t>
+      </w:r>
+    </w:p>
+    <w:p>
+      <w:pPr>
+        <w:pStyle w:val="Default"/>
+        <w:rPr>
+          <w:color w:val="auto"/>
+        </w:rPr>
+        <w:sectPr>
+          <w:pgSz w:w="11906" w:h="17338"/>
+          <w:pgMar w:top="1834" w:right="855" w:bottom="1400" w:left="1139" w:header="720" w:footer="720" w:gutter="0"/>
+          <w:cols w:space="720"/>
+          <w:noEndnote/>
+        </w:sectPr>
+      </w:pPr>
+    </w:p>
+    <w:p>
+      <w:pPr>
+        <w:pStyle w:val="Default"/>
+        <w:rPr>
+          <w:color w:val="auto"/>
+          <w:sz w:val="23"/>
+          <w:szCs w:val="23"/>
+        </w:rPr>
+      </w:pPr>
+      <w:r>
+        <w:rPr>
+          <w:color w:val="auto"/>
+          <w:sz w:val="23"/>
+          <w:szCs w:val="23"/>
+        </w:rPr>
+        <w:lastRenderedPageBreak/>
+        <w:t xml:space="preserve">During the Campaign, we performed the mapping, flight path establishment and the flight testing for FC30. The result after the campaign completed are </w:t>
+      </w:r>
+    </w:p>
+    <w:p>
+      <w:pPr>
+        <w:pStyle w:val="Default"/>
+        <w:spacing w:after="4"/>
+        <w:rPr>
+          <w:color w:val="auto"/>
+          <w:sz w:val="23"/>
+          <w:szCs w:val="23"/>
+        </w:rPr>
+      </w:pPr>
+      <w:r>
+        <w:rPr>
+          <w:b/>
+          <w:bCs/>
+          <w:color w:val="auto"/>
+          <w:sz w:val="23"/>
+          <w:szCs w:val="23"/>
+        </w:rPr>
+        <w:t xml:space="preserve">a. Mapping </w:t>
+      </w:r>
+    </w:p>
+    <w:p>
+      <w:pPr>
+        <w:pStyle w:val="Default"/>
+        <w:spacing w:after="4"/>
+        <w:rPr>
+          <w:color w:val="auto"/>
+          <w:sz w:val="23"/>
+          <w:szCs w:val="23"/>
+        </w:rPr>
+      </w:pPr>
+      <w:r>
+        <w:rPr>
+          <w:color w:val="auto"/>
+          <w:sz w:val="23"/>
+          <w:szCs w:val="23"/>
+        </w:rPr>
+        <w:t xml:space="preserve"> Nubri Four Season Apple Farm </w:t>
+      </w:r>
+    </w:p>
+    <w:p>
+      <w:pPr>
+        <w:pStyle w:val="Default"/>
+        <w:spacing w:after="4"/>
+        <w:rPr>
+          <w:color w:val="auto"/>
+          <w:sz w:val="23"/>
+          <w:szCs w:val="23"/>
+        </w:rPr>
+      </w:pPr>
+      <w:r>
+        <w:rPr>
+          <w:color w:val="auto"/>
+          <w:sz w:val="23"/>
+          <w:szCs w:val="23"/>
+        </w:rPr>
+        <w:t xml:space="preserve"> Nubri Four Season Hotel, Namrung </w:t>
+      </w:r>
+    </w:p>
+    <w:p>
+      <w:pPr>
+        <w:pStyle w:val="Default"/>
+        <w:spacing w:after="4"/>
+        <w:rPr>
+          <w:color w:val="auto"/>
+          <w:sz w:val="23"/>
+          <w:szCs w:val="23"/>
+        </w:rPr>
+      </w:pPr>
+      <w:r>
+        <w:rPr>
+          <w:color w:val="auto"/>
+          <w:sz w:val="23"/>
+          <w:szCs w:val="23"/>
+        </w:rPr>
+        <w:t xml:space="preserve"> Apple Farm owned by Mr. </w:t>
+      </w:r>
+      <w:proofErr w:type="spellStart"/>
+      <w:r>
+        <w:rPr>
+          <w:color w:val="auto"/>
+          <w:sz w:val="23"/>
+          <w:szCs w:val="23"/>
+        </w:rPr>
+        <w:t>Tshering</w:t>
+      </w:r>
+      <w:proofErr w:type="spellEnd"/>
+      <w:r>
+        <w:rPr>
+          <w:color w:val="auto"/>
+          <w:sz w:val="23"/>
+          <w:szCs w:val="23"/>
+        </w:rPr>
+        <w:t xml:space="preserve"> from </w:t>
+      </w:r>
+      <w:proofErr w:type="spellStart"/>
+      <w:r>
+        <w:rPr>
+          <w:color w:val="auto"/>
+          <w:sz w:val="23"/>
+          <w:szCs w:val="23"/>
+        </w:rPr>
+        <w:t>Lho</w:t>
+      </w:r>
+      <w:proofErr w:type="spellEnd"/>
+      <w:r>
+        <w:rPr>
+          <w:color w:val="auto"/>
+          <w:sz w:val="23"/>
+          <w:szCs w:val="23"/>
+        </w:rPr>
+        <w:t xml:space="preserve"> </w:t>
+      </w:r>
+    </w:p>
+    <w:p>
+      <w:pPr>
+        <w:pStyle w:val="Default"/>
+        <w:spacing w:after="4"/>
+        <w:rPr>
+          <w:color w:val="auto"/>
+          <w:sz w:val="23"/>
+          <w:szCs w:val="23"/>
+        </w:rPr>
+      </w:pPr>
+      <w:r>
+        <w:rPr>
+          <w:color w:val="auto"/>
+          <w:sz w:val="23"/>
+          <w:szCs w:val="23"/>
+        </w:rPr>
+        <w:t xml:space="preserve"> SamaGaun </w:t>
+      </w:r>
+    </w:p>
+    <w:p>
+      <w:pPr>
+        <w:pStyle w:val="Default"/>
+        <w:spacing w:after="4"/>
+        <w:rPr>
+          <w:color w:val="auto"/>
+          <w:sz w:val="23"/>
+          <w:szCs w:val="23"/>
+        </w:rPr>
+      </w:pPr>
+      <w:r>
+        <w:rPr>
+          <w:color w:val="auto"/>
+          <w:sz w:val="23"/>
+          <w:szCs w:val="23"/>
+        </w:rPr>
+        <w:t xml:space="preserve"> Birendra Lake and its Catchment Area </w:t>
+      </w:r>
+    </w:p>
+    <w:p>
+      <w:pPr>
+        <w:pStyle w:val="Default"/>
+        <w:spacing w:after="4"/>
+        <w:rPr>
+          <w:color w:val="auto"/>
+          <w:sz w:val="23"/>
+          <w:szCs w:val="23"/>
+        </w:rPr>
+      </w:pPr>
+      <w:r>
+        <w:rPr>
+          <w:color w:val="auto"/>
+          <w:sz w:val="23"/>
+          <w:szCs w:val="23"/>
+        </w:rPr>
+        <w:t xml:space="preserve"> Manaslu Base Camp </w:t>
+      </w:r>
+    </w:p>
+    <w:p>
+      <w:pPr>
+        <w:pStyle w:val="Default"/>
+        <w:spacing w:after="4"/>
+        <w:rPr>
+          <w:color w:val="auto"/>
+          <w:sz w:val="23"/>
+          <w:szCs w:val="23"/>
+        </w:rPr>
+      </w:pPr>
+      <w:r>
+        <w:rPr>
+          <w:color w:val="auto"/>
+          <w:sz w:val="23"/>
+          <w:szCs w:val="23"/>
+        </w:rPr>
+        <w:t xml:space="preserve"> Glacier of Manaslu </w:t>
+      </w:r>
+    </w:p>
+    <w:p>
+      <w:pPr>
+        <w:pStyle w:val="Default"/>
+        <w:rPr>
+          <w:color w:val="auto"/>
+          <w:sz w:val="23"/>
+          <w:szCs w:val="23"/>
+        </w:rPr>
+      </w:pPr>
+      <w:r>
+        <w:rPr>
+          <w:color w:val="auto"/>
+          <w:sz w:val="23"/>
+          <w:szCs w:val="23"/>
+        </w:rPr>
+        <w:t xml:space="preserve"> Co-ordinate and visuals of the delivery and collection zone at Camp1, Camp2 and Camp 3 </w:t>
+      </w:r>
+    </w:p>
+    <w:p>
+      <w:pPr>
+        <w:pStyle w:val="Default"/>
+        <w:rPr>
+          <w:color w:val="auto"/>
+          <w:sz w:val="23"/>
+          <w:szCs w:val="23"/>
+        </w:rPr>
+      </w:pPr>
+    </w:p>
+    <w:p>
+      <w:pPr>
+        <w:pStyle w:val="Default"/>
+        <w:rPr>
+          <w:color w:val="auto"/>
+          <w:sz w:val="23"/>
+          <w:szCs w:val="23"/>
+        </w:rPr>
+      </w:pPr>
+      <w:r>
+        <w:rPr>
+          <w:b/>
+          <w:bCs/>
+          <w:color w:val="auto"/>
+          <w:sz w:val="23"/>
+          <w:szCs w:val="23"/>
+        </w:rPr>
+        <w:t xml:space="preserve">b. FC 30 Operation </w:t>
+      </w:r>
+    </w:p>
+    <w:p>
+      <w:pPr>
+        <w:pStyle w:val="Default"/>
+        <w:rPr>
+          <w:color w:val="auto"/>
+          <w:sz w:val="23"/>
+          <w:szCs w:val="23"/>
+        </w:rPr>
+      </w:pPr>
+    </w:p>
+    <w:p>
+      <w:pPr>
+        <w:pStyle w:val="Default"/>
+        <w:rPr>
+          <w:color w:val="auto"/>
+          <w:sz w:val="23"/>
+          <w:szCs w:val="23"/>
+        </w:rPr>
+      </w:pPr>
+      <w:r>
+        <w:rPr>
+          <w:color w:val="auto"/>
+          <w:sz w:val="23"/>
+          <w:szCs w:val="23"/>
+        </w:rPr>
+        <w:t xml:space="preserve">Flight Plans were made and waypoints were created. </w:t>
+      </w:r>
+    </w:p>
+    <w:p>
+      <w:pPr>
+        <w:pStyle w:val="Default"/>
+        <w:rPr>
+          <w:color w:val="auto"/>
+          <w:sz w:val="23"/>
+          <w:szCs w:val="23"/>
+        </w:rPr>
+      </w:pPr>
+      <w:r>
+        <w:rPr>
+          <w:b/>
+          <w:bCs/>
+          <w:color w:val="auto"/>
+          <w:sz w:val="23"/>
+          <w:szCs w:val="23"/>
+        </w:rPr>
+        <w:t xml:space="preserve">c. Field Reconnaissance </w:t>
+      </w:r>
+    </w:p>
+    <w:p>
+      <w:pPr>
+        <w:pStyle w:val="Default"/>
+        <w:rPr>
+          <w:color w:val="auto"/>
+          <w:sz w:val="23"/>
+          <w:szCs w:val="23"/>
+        </w:rPr>
+      </w:pPr>
+    </w:p>
+    <w:p>
+      <w:pPr>
+        <w:pStyle w:val="Default"/>
+        <w:rPr>
+          <w:color w:val="auto"/>
+          <w:sz w:val="23"/>
+          <w:szCs w:val="23"/>
+        </w:rPr>
+      </w:pPr>
+      <w:r>
+        <w:rPr>
+          <w:color w:val="auto"/>
+          <w:sz w:val="23"/>
+          <w:szCs w:val="23"/>
+        </w:rPr>
+        <w:t xml:space="preserve">During the campaign, we found out that the elevation difference on the lower and upper part of basecamp were about 350m and there was great variation of weather within few minutes. A large mist </w:t>
+      </w:r>
+      <w:proofErr w:type="spellStart"/>
+      <w:r>
+        <w:rPr>
+          <w:color w:val="auto"/>
+          <w:sz w:val="23"/>
+          <w:szCs w:val="23"/>
+        </w:rPr>
+        <w:t>mist</w:t>
+      </w:r>
+      <w:proofErr w:type="spellEnd"/>
+      <w:r>
+        <w:rPr>
+          <w:color w:val="auto"/>
+          <w:sz w:val="23"/>
+          <w:szCs w:val="23"/>
+        </w:rPr>
+        <w:t xml:space="preserve"> would come up very fast from the </w:t>
+      </w:r>
+      <w:proofErr w:type="spellStart"/>
+      <w:r>
+        <w:rPr>
+          <w:color w:val="auto"/>
+          <w:sz w:val="23"/>
+          <w:szCs w:val="23"/>
+        </w:rPr>
+        <w:t>Birendra</w:t>
+      </w:r>
+      <w:proofErr w:type="spellEnd"/>
+      <w:r>
+        <w:rPr>
+          <w:color w:val="auto"/>
+          <w:sz w:val="23"/>
+          <w:szCs w:val="23"/>
+        </w:rPr>
+        <w:t xml:space="preserve"> Lake side. And it was pretty short window to operate with FC30 as it was pretty hard to get the weather both at base camp and the upper camps. </w:t>
+      </w:r>
+    </w:p>
+    <w:p>
+      <w:pPr>
+        <w:pStyle w:val="Default"/>
+        <w:rPr>
+          <w:color w:val="auto"/>
+          <w:sz w:val="23"/>
+          <w:szCs w:val="23"/>
+        </w:rPr>
+      </w:pPr>
+      <w:r>
+        <w:rPr>
+          <w:color w:val="auto"/>
+          <w:sz w:val="23"/>
+          <w:szCs w:val="23"/>
+        </w:rPr>
+        <w:t xml:space="preserve">The clear visibility between the Camp 1 and Drone </w:t>
+      </w:r>
+      <w:proofErr w:type="spellStart"/>
+      <w:r>
+        <w:rPr>
+          <w:color w:val="auto"/>
+          <w:sz w:val="23"/>
+          <w:szCs w:val="23"/>
+        </w:rPr>
+        <w:t>lauchpad</w:t>
+      </w:r>
+      <w:proofErr w:type="spellEnd"/>
+      <w:r>
+        <w:rPr>
+          <w:color w:val="auto"/>
+          <w:sz w:val="23"/>
+          <w:szCs w:val="23"/>
+        </w:rPr>
+        <w:t xml:space="preserve"> was not possible but a hill from 2 hours walk above the Camp 1 got a good visibility. Similarly Camp 2 and Camp 3 had clear visibility from the Drone Launch Pad. </w:t>
+      </w:r>
+    </w:p>
+    <w:p>
+      <w:pPr>
+        <w:pStyle w:val="Default"/>
+        <w:rPr>
+          <w:color w:val="auto"/>
+          <w:sz w:val="23"/>
+          <w:szCs w:val="23"/>
+        </w:rPr>
+      </w:pPr>
+      <w:r>
+        <w:rPr>
+          <w:color w:val="auto"/>
+          <w:sz w:val="23"/>
+          <w:szCs w:val="23"/>
+        </w:rPr>
+        <w:t xml:space="preserve">A Mini Hydropower was available, operated by </w:t>
+      </w:r>
+      <w:proofErr w:type="spellStart"/>
+      <w:r>
+        <w:rPr>
+          <w:color w:val="auto"/>
+          <w:sz w:val="23"/>
+          <w:szCs w:val="23"/>
+        </w:rPr>
+        <w:t>ImagineNepal</w:t>
+      </w:r>
+      <w:proofErr w:type="spellEnd"/>
+      <w:r>
+        <w:rPr>
+          <w:color w:val="auto"/>
+          <w:sz w:val="23"/>
+          <w:szCs w:val="23"/>
+        </w:rPr>
+        <w:t xml:space="preserve"> Club. From the interview with the </w:t>
+      </w:r>
+      <w:proofErr w:type="spellStart"/>
+      <w:r>
+        <w:rPr>
+          <w:color w:val="auto"/>
+          <w:sz w:val="23"/>
+          <w:szCs w:val="23"/>
+        </w:rPr>
+        <w:t>Sherpas</w:t>
+      </w:r>
+      <w:proofErr w:type="spellEnd"/>
+      <w:r>
+        <w:rPr>
+          <w:color w:val="auto"/>
+          <w:sz w:val="23"/>
+          <w:szCs w:val="23"/>
+        </w:rPr>
+        <w:t xml:space="preserve">, it was found that the weather at </w:t>
+      </w:r>
+      <w:proofErr w:type="spellStart"/>
+      <w:r>
+        <w:rPr>
+          <w:color w:val="auto"/>
+          <w:sz w:val="23"/>
+          <w:szCs w:val="23"/>
+        </w:rPr>
+        <w:t>Manaslu</w:t>
+      </w:r>
+      <w:proofErr w:type="spellEnd"/>
+      <w:r>
+        <w:rPr>
+          <w:color w:val="auto"/>
+          <w:sz w:val="23"/>
+          <w:szCs w:val="23"/>
+        </w:rPr>
+        <w:t xml:space="preserve"> is really unpredictable as it may change rapidly. And there is a little or small about of breeze at upper camps and a maximum of about 8m/s of wind was observed while operating with M3E around base camp. </w:t>
+      </w:r>
+    </w:p>
+    <w:p>
+      <w:pPr>
+        <w:pStyle w:val="Default"/>
+        <w:rPr>
+          <w:color w:val="auto"/>
+          <w:sz w:val="23"/>
+          <w:szCs w:val="23"/>
+        </w:rPr>
+      </w:pPr>
+      <w:r>
+        <w:rPr>
+          <w:color w:val="auto"/>
+          <w:sz w:val="23"/>
+          <w:szCs w:val="23"/>
+        </w:rPr>
+        <w:t xml:space="preserve">From the data collected during the mapping, we have created a 3D model and the </w:t>
+      </w:r>
+      <w:proofErr w:type="spellStart"/>
+      <w:r>
+        <w:rPr>
+          <w:color w:val="auto"/>
+          <w:sz w:val="23"/>
+          <w:szCs w:val="23"/>
+        </w:rPr>
+        <w:t>orthomosaic</w:t>
+      </w:r>
+      <w:proofErr w:type="spellEnd"/>
+      <w:r>
+        <w:rPr>
+          <w:color w:val="auto"/>
+          <w:sz w:val="23"/>
+          <w:szCs w:val="23"/>
+        </w:rPr>
+        <w:t xml:space="preserve"> covering </w:t>
+      </w:r>
+      <w:proofErr w:type="spellStart"/>
+      <w:r>
+        <w:rPr>
+          <w:color w:val="auto"/>
+          <w:sz w:val="23"/>
+          <w:szCs w:val="23"/>
+        </w:rPr>
+        <w:t>Galcier</w:t>
+      </w:r>
+      <w:proofErr w:type="spellEnd"/>
+      <w:r>
+        <w:rPr>
+          <w:color w:val="auto"/>
+          <w:sz w:val="23"/>
+          <w:szCs w:val="23"/>
+        </w:rPr>
+        <w:t xml:space="preserve"> and Base Camp of Mt. </w:t>
+      </w:r>
+      <w:proofErr w:type="spellStart"/>
+      <w:r>
+        <w:rPr>
+          <w:color w:val="auto"/>
+          <w:sz w:val="23"/>
+          <w:szCs w:val="23"/>
+        </w:rPr>
+        <w:t>Manaslu</w:t>
+      </w:r>
+      <w:proofErr w:type="spellEnd"/>
+      <w:r>
+        <w:rPr>
+          <w:color w:val="auto"/>
+          <w:sz w:val="23"/>
+          <w:szCs w:val="23"/>
+        </w:rPr>
+        <w:t xml:space="preserve">, </w:t>
+      </w:r>
+      <w:proofErr w:type="spellStart"/>
+      <w:r>
+        <w:rPr>
+          <w:color w:val="auto"/>
+          <w:sz w:val="23"/>
+          <w:szCs w:val="23"/>
+        </w:rPr>
+        <w:t>Birendra</w:t>
+      </w:r>
+      <w:proofErr w:type="spellEnd"/>
+      <w:r>
+        <w:rPr>
+          <w:color w:val="auto"/>
+          <w:sz w:val="23"/>
+          <w:szCs w:val="23"/>
+        </w:rPr>
+        <w:t xml:space="preserve"> Lake and its catchment area and, </w:t>
+      </w:r>
+      <w:proofErr w:type="spellStart"/>
+      <w:r>
+        <w:rPr>
+          <w:color w:val="auto"/>
+          <w:sz w:val="23"/>
+          <w:szCs w:val="23"/>
+        </w:rPr>
+        <w:t>Samangaun</w:t>
+      </w:r>
+      <w:proofErr w:type="spellEnd"/>
+      <w:r>
+        <w:rPr>
+          <w:color w:val="auto"/>
+          <w:sz w:val="23"/>
+          <w:szCs w:val="23"/>
+        </w:rPr>
+        <w:t xml:space="preserve">. The total area mapped is about 5.5 </w:t>
+      </w:r>
+      <w:proofErr w:type="spellStart"/>
+      <w:r>
+        <w:rPr>
+          <w:color w:val="auto"/>
+          <w:sz w:val="23"/>
+          <w:szCs w:val="23"/>
+        </w:rPr>
+        <w:t>sq</w:t>
+      </w:r>
+      <w:proofErr w:type="spellEnd"/>
+      <w:r>
+        <w:rPr>
+          <w:color w:val="auto"/>
+          <w:sz w:val="23"/>
+          <w:szCs w:val="23"/>
+        </w:rPr>
+        <w:t xml:space="preserve"> km. </w:t>
+      </w:r>
+    </w:p>
+    <w:p>
+      <w:pPr>
+        <w:pStyle w:val="Default"/>
+        <w:rPr>
+          <w:color w:val="auto"/>
+          <w:sz w:val="23"/>
+          <w:szCs w:val="23"/>
+        </w:rPr>
+      </w:pPr>
+      <w:r>
+        <w:rPr>
+          <w:color w:val="auto"/>
+          <w:sz w:val="23"/>
+          <w:szCs w:val="23"/>
+        </w:rPr>
+        <w:t xml:space="preserve">The collected data were processed in DJI TERRA and DJI MODIFY. The output were point cloud, DEM, </w:t>
+      </w:r>
+      <w:proofErr w:type="spellStart"/>
+      <w:r>
+        <w:rPr>
+          <w:color w:val="auto"/>
+          <w:sz w:val="23"/>
+          <w:szCs w:val="23"/>
+        </w:rPr>
+        <w:t>orthomosaic</w:t>
+      </w:r>
+      <w:proofErr w:type="spellEnd"/>
+      <w:r>
+        <w:rPr>
+          <w:color w:val="auto"/>
+          <w:sz w:val="23"/>
+          <w:szCs w:val="23"/>
+        </w:rPr>
+        <w:t xml:space="preserve"> and 3D model. From these output an analysis is to be prepared. </w:t>
+      </w:r>
+    </w:p>
+    <w:p>
+      <w:pPr>
+        <w:rPr>
+          <w:sz w:val="23"/>
+          <w:szCs w:val="23"/>
+        </w:rPr>
+      </w:pPr>
+      <w:r>
+        <w:rPr>
+          <w:sz w:val="23"/>
+          <w:szCs w:val="23"/>
+        </w:rPr>
+        <w:t>For the Drone Delivery operation, the campaign helped to prepare the flight plan, determine the resources and manpower needed, understand the geography for operating and be planned for any harsh situation if face in near future operations.</w:t>
+      </w:r>
+    </w:p>
+    <w:p>
+      <w:pPr>
+        <w:rPr>
+          <w:sz w:val="23"/>
+          <w:szCs w:val="23"/>
+        </w:rPr>
+      </w:pPr>
+    </w:p>
+    <w:p>
+      <w:pPr>
+        <w:pStyle w:val="Default"/>
+        <w:rPr>
+          <w:sz w:val="32"/>
+          <w:szCs w:val="32"/>
+        </w:rPr>
+      </w:pPr>
+      <w:r>
+        <w:rPr>
+          <w:b/>
+          <w:bCs/>
+          <w:sz w:val="32"/>
+          <w:szCs w:val="32"/>
+        </w:rPr>
+        <w:t xml:space="preserve">Conclusion </w:t>
+      </w:r>
+    </w:p>
+    <w:p>
+      <w:pPr>
+        <w:pStyle w:val="Default"/>
+        <w:rPr>
+          <w:sz w:val="23"/>
+          <w:szCs w:val="23"/>
+        </w:rPr>
+      </w:pPr>
+      <w:r>
+        <w:rPr>
+          <w:sz w:val="23"/>
+          <w:szCs w:val="23"/>
+        </w:rPr>
+        <w:t xml:space="preserve">The </w:t>
+      </w:r>
+      <w:r>
+        <w:rPr>
+          <w:b/>
+          <w:bCs/>
+          <w:sz w:val="23"/>
+          <w:szCs w:val="23"/>
+        </w:rPr>
+        <w:t xml:space="preserve">mapping and field reconnaissance </w:t>
+      </w:r>
+      <w:r>
+        <w:rPr>
+          <w:sz w:val="23"/>
+          <w:szCs w:val="23"/>
+        </w:rPr>
+        <w:t xml:space="preserve">were successful as per planned but despite of strong preparation and team effort, the </w:t>
+      </w:r>
+      <w:r>
+        <w:rPr>
+          <w:b/>
+          <w:bCs/>
+          <w:sz w:val="23"/>
+          <w:szCs w:val="23"/>
+        </w:rPr>
+        <w:t xml:space="preserve">Airlift Kailas </w:t>
+      </w:r>
+      <w:proofErr w:type="spellStart"/>
+      <w:r>
+        <w:rPr>
+          <w:b/>
+          <w:bCs/>
+          <w:sz w:val="23"/>
+          <w:szCs w:val="23"/>
+        </w:rPr>
+        <w:t>Manaslu</w:t>
+      </w:r>
+      <w:proofErr w:type="spellEnd"/>
+      <w:r>
+        <w:rPr>
+          <w:b/>
+          <w:bCs/>
+          <w:sz w:val="23"/>
+          <w:szCs w:val="23"/>
+        </w:rPr>
+        <w:t xml:space="preserve"> Cleanup Camp – 2025 </w:t>
+      </w:r>
+      <w:r>
+        <w:rPr>
+          <w:sz w:val="23"/>
+          <w:szCs w:val="23"/>
+        </w:rPr>
+        <w:t xml:space="preserve">faced significant </w:t>
+      </w:r>
+      <w:r>
+        <w:rPr>
+          <w:b/>
+          <w:bCs/>
+          <w:sz w:val="23"/>
+          <w:szCs w:val="23"/>
+        </w:rPr>
+        <w:t xml:space="preserve">technical setbacks </w:t>
+      </w:r>
+      <w:r>
+        <w:rPr>
+          <w:sz w:val="23"/>
+          <w:szCs w:val="23"/>
+        </w:rPr>
+        <w:t xml:space="preserve">that prevented successful drone-based waste transportation. The unstable GNSS connection and sensor issues made it unsafe to proceed with high-altitude flights. Nevertheless, the mission provided valuable </w:t>
+      </w:r>
+      <w:r>
+        <w:rPr>
+          <w:b/>
+          <w:bCs/>
+          <w:sz w:val="23"/>
+          <w:szCs w:val="23"/>
+        </w:rPr>
+        <w:t xml:space="preserve">technical insights </w:t>
+      </w:r>
+      <w:r>
+        <w:rPr>
+          <w:sz w:val="23"/>
+          <w:szCs w:val="23"/>
+        </w:rPr>
+        <w:t xml:space="preserve">and </w:t>
+      </w:r>
+      <w:r>
+        <w:rPr>
+          <w:b/>
+          <w:bCs/>
+          <w:sz w:val="23"/>
+          <w:szCs w:val="23"/>
+        </w:rPr>
+        <w:t xml:space="preserve">field </w:t>
+      </w:r>
+    </w:p>
+    <w:p>
+      <w:pPr>
+        <w:pStyle w:val="Default"/>
+        <w:pageBreakBefore/>
+        <w:rPr>
+          <w:sz w:val="23"/>
+          <w:szCs w:val="23"/>
+        </w:rPr>
+      </w:pPr>
+      <w:proofErr w:type="gramStart"/>
+      <w:r>
+        <w:rPr>
+          <w:b/>
+          <w:bCs/>
+          <w:sz w:val="23"/>
+          <w:szCs w:val="23"/>
+        </w:rPr>
+        <w:lastRenderedPageBreak/>
+        <w:t>experience</w:t>
+      </w:r>
+      <w:proofErr w:type="gramEnd"/>
+      <w:r>
+        <w:rPr>
+          <w:b/>
+          <w:bCs/>
+          <w:sz w:val="23"/>
+          <w:szCs w:val="23"/>
+        </w:rPr>
+        <w:t xml:space="preserve"> </w:t>
+      </w:r>
+      <w:r>
+        <w:rPr>
+          <w:sz w:val="23"/>
+          <w:szCs w:val="23"/>
+        </w:rPr>
+        <w:t xml:space="preserve">for future high-altitude drone logistics operations in extreme environments. </w:t>
+      </w:r>
+    </w:p>
+    <w:p>
+      <w:pPr>
+        <w:rPr>
+          <w:sz w:val="23"/>
+          <w:szCs w:val="23"/>
+        </w:rPr>
+      </w:pPr>
+      <w:r>
+        <w:rPr>
+          <w:sz w:val="23"/>
+          <w:szCs w:val="23"/>
+        </w:rPr>
+        <w:t>The campaign got success to an extent but the main objective to collect the garbage from Camp 1 couldn’t take place. But the learning was a great add-on for the team on operating at such condition on high-altitude.</w:t>
+      </w:r>
+    </w:p>
+    <w:p>
+      <w:pPr>
+        <w:rPr>
+          <w:sz w:val="23"/>
+          <w:szCs w:val="23"/>
+        </w:rPr>
+      </w:pPr>
+    </w:p>
+    <w:p>
+      <w:r>
+        <w:t>Airlift Kailas Cleanup Campaign</w:t>
+      </w:r>
+    </w:p>
+    <w:p/>
+    <w:p>
+      <w:r>
+        <w:t>Document Control</w:t>
+      </w:r>
+    </w:p>
+    <w:p>
+      <w:r>
+        <w:t>•</w:t>
+      </w:r>
+      <w:r>
+        <w:tab/>
+        <w:t>Document Title:</w:t>
+      </w:r>
+      <w:r>
+        <w:tab/>
+        <w:t>Airlift Kailas Cleanup Campaign Technical Report</w:t>
+      </w:r>
+    </w:p>
+    <w:p>
+      <w:r>
+        <w:t>•</w:t>
+      </w:r>
+      <w:r>
+        <w:tab/>
+        <w:t>Expedition Dates:</w:t>
+      </w:r>
+      <w:r>
+        <w:tab/>
+        <w:t>September 4–27, 2025</w:t>
+      </w:r>
+    </w:p>
+    <w:p/>
+    <w:p>
+      <w:r>
+        <w:t>Table of Contents</w:t>
+      </w:r>
+    </w:p>
+    <w:p>
+      <w:r>
+        <w:t>1</w:t>
+      </w:r>
+      <w:r>
+        <w:tab/>
+        <w:t>Executive Summary</w:t>
+      </w:r>
+      <w:r>
+        <w:tab/>
+        <w:t>2</w:t>
+      </w:r>
+    </w:p>
+    <w:p>
+      <w:r>
+        <w:t>2</w:t>
+      </w:r>
+      <w:r>
+        <w:tab/>
+        <w:t>Expedition Overview</w:t>
+      </w:r>
+      <w:r>
+        <w:tab/>
+        <w:t>2</w:t>
+      </w:r>
+    </w:p>
+    <w:p>
+      <w:r>
+        <w:tab/>
+        <w:t>2.1</w:t>
+      </w:r>
+      <w:r>
+        <w:tab/>
+        <w:t>Context &amp; Significance</w:t>
+      </w:r>
+      <w:r>
+        <w:tab/>
+        <w:t>2</w:t>
+      </w:r>
+    </w:p>
+    <w:p>
+      <w:r>
+        <w:tab/>
+        <w:t>2.2</w:t>
+      </w:r>
+      <w:r>
+        <w:tab/>
+        <w:t>Strategic Objectives</w:t>
+      </w:r>
+      <w:r>
+        <w:tab/>
+        <w:t>2</w:t>
+      </w:r>
+    </w:p>
+    <w:p>
+      <w:r>
+        <w:t>3</w:t>
+      </w:r>
+      <w:r>
+        <w:tab/>
+        <w:t>Methodology &amp; Field Operations</w:t>
+      </w:r>
+      <w:r>
+        <w:tab/>
+        <w:t>3</w:t>
+      </w:r>
+    </w:p>
+    <w:p>
+      <w:r>
+        <w:tab/>
+        <w:t>3.1</w:t>
+      </w:r>
+      <w:r>
+        <w:tab/>
+        <w:t>Technical Framework</w:t>
+      </w:r>
+      <w:r>
+        <w:tab/>
+        <w:t>3</w:t>
+      </w:r>
+    </w:p>
+    <w:p>
+      <w:r>
+        <w:tab/>
+        <w:t>3.2</w:t>
+      </w:r>
+      <w:r>
+        <w:tab/>
+        <w:t>Operational Sites</w:t>
+      </w:r>
+      <w:r>
+        <w:tab/>
+        <w:t>3</w:t>
+      </w:r>
+    </w:p>
+    <w:p>
+      <w:r>
+        <w:tab/>
+        <w:t>3.3</w:t>
+      </w:r>
+      <w:r>
+        <w:tab/>
+        <w:t>Data Collection Protocol</w:t>
+      </w:r>
+      <w:r>
+        <w:tab/>
+        <w:t>4</w:t>
+      </w:r>
+    </w:p>
+    <w:p>
+      <w:r>
+        <w:t>4</w:t>
+      </w:r>
+      <w:r>
+        <w:tab/>
+        <w:t>Key Findings &amp; Technical Analysis</w:t>
+      </w:r>
+      <w:r>
+        <w:tab/>
+        <w:t>5</w:t>
+      </w:r>
+    </w:p>
+    <w:p>
+      <w:r>
+        <w:tab/>
+        <w:t>4.1</w:t>
+      </w:r>
+      <w:r>
+        <w:tab/>
+        <w:t>Environmental Constraints</w:t>
+      </w:r>
+      <w:r>
+        <w:tab/>
+        <w:t>5</w:t>
+      </w:r>
+    </w:p>
+    <w:p>
+      <w:r>
+        <w:tab/>
+        <w:t>4.2</w:t>
+      </w:r>
+      <w:r>
+        <w:tab/>
+        <w:t>Communications Infrastructure</w:t>
+      </w:r>
+      <w:r>
+        <w:tab/>
+        <w:t>5</w:t>
+      </w:r>
+    </w:p>
+    <w:p>
+      <w:r>
+        <w:tab/>
+        <w:t>4.3</w:t>
+      </w:r>
+      <w:r>
+        <w:tab/>
+        <w:t>Geospatial Deliverables</w:t>
+      </w:r>
+      <w:r>
+        <w:tab/>
+        <w:t>5</w:t>
+      </w:r>
+    </w:p>
+    <w:p>
+      <w:r>
+        <w:t>5</w:t>
+      </w:r>
+      <w:r>
+        <w:tab/>
+        <w:t>Technical Limitations &amp; Lessons Learned</w:t>
+      </w:r>
+      <w:r>
+        <w:tab/>
+        <w:t>6</w:t>
+      </w:r>
+    </w:p>
+    <w:p>
+      <w:r>
+        <w:tab/>
+        <w:t>5.1</w:t>
+      </w:r>
+      <w:r>
+        <w:tab/>
+        <w:t>System Constraints Encountered</w:t>
+      </w:r>
+      <w:r>
+        <w:tab/>
+        <w:t>6</w:t>
+      </w:r>
+    </w:p>
+    <w:p>
+      <w:r>
+        <w:tab/>
+        <w:t>5.2</w:t>
+      </w:r>
+      <w:r>
+        <w:tab/>
+        <w:t>Operational Adaptations</w:t>
+      </w:r>
+      <w:r>
+        <w:tab/>
+        <w:t>6</w:t>
+      </w:r>
+    </w:p>
+    <w:p>
+      <w:r>
+        <w:t>6</w:t>
+      </w:r>
+      <w:r>
+        <w:tab/>
+        <w:t>Strategic Implications &amp; Future Trajectory</w:t>
+      </w:r>
+      <w:r>
+        <w:tab/>
+        <w:t>7</w:t>
+      </w:r>
+    </w:p>
+    <w:p>
+      <w:r>
+        <w:tab/>
+        <w:t>6.1</w:t>
+      </w:r>
+      <w:r>
+        <w:tab/>
+        <w:t>Immediate Applications</w:t>
+      </w:r>
+      <w:r>
+        <w:tab/>
+        <w:t>7</w:t>
+      </w:r>
+    </w:p>
+    <w:p>
+      <w:r>
+        <w:tab/>
+        <w:t>6.2</w:t>
+      </w:r>
+      <w:r>
+        <w:tab/>
+        <w:t>Long-term Institutional Value</w:t>
+      </w:r>
+      <w:r>
+        <w:tab/>
+        <w:t>7</w:t>
+      </w:r>
+    </w:p>
+    <w:p>
+      <w:r>
+        <w:t>7</w:t>
+      </w:r>
+      <w:r>
+        <w:tab/>
+        <w:t>Conclusion</w:t>
+      </w:r>
+      <w:r>
+        <w:tab/>
+        <w:t>8</w:t>
+      </w:r>
+    </w:p>
+    <w:p/>
+    <w:p>
+      <w:r>
+        <w:lastRenderedPageBreak/>
+        <w:t>1</w:t>
+      </w:r>
+      <w:r>
+        <w:tab/>
+        <w:t>Executive Summary</w:t>
+      </w:r>
+    </w:p>
+    <w:p>
+      <w:r>
+        <w:t xml:space="preserve">The Airlift Kailas Cleanup Campaign (September 4–27, 2025) represents a systematic advancement in high-altitude drone logistics and environmental reconnaissance at Mt. </w:t>
+      </w:r>
+      <w:proofErr w:type="spellStart"/>
+      <w:r>
+        <w:t>Manaslu</w:t>
+      </w:r>
+      <w:proofErr w:type="spellEnd"/>
+      <w:r>
+        <w:t xml:space="preserve"> (8,163 m). While the primary objective of waste transport between Base Camp and Camp 1 was not achieved due to technical constraints, the expedition successfully executed comprehensive terrain mapping, established critical operational parameters, and generated foundational datasets for future autonomous logistics systems in extreme environments.</w:t>
+      </w:r>
+    </w:p>
+    <w:p/>
+    <w:p>
+      <w:r>
+        <w:t>The 24-day deployment yielded 5.5 km² of high-resolution geospatial data, identified key environmental challenges including rapid meteorological shifts and line-of-sight limitations, and produced actionable intelligence for both humanitarian logistics and climate research. This report documents technical specifications, operational challenges, and strategic recommendations for future deployments.</w:t>
+      </w:r>
+    </w:p>
+    <w:p/>
+    <w:p>
+      <w:r>
+        <w:t>2</w:t>
+      </w:r>
+      <w:r>
+        <w:tab/>
+        <w:t>Expedition Overview</w:t>
+      </w:r>
+    </w:p>
+    <w:p>
+      <w:r>
+        <w:t>2.1</w:t>
+      </w:r>
+      <w:r>
+        <w:tab/>
+        <w:t>Context &amp; Significance</w:t>
+      </w:r>
+    </w:p>
+    <w:p>
+      <w:r>
+        <w:t xml:space="preserve">Mount </w:t>
+      </w:r>
+      <w:proofErr w:type="spellStart"/>
+      <w:r>
+        <w:t>Manaslu</w:t>
+      </w:r>
+      <w:proofErr w:type="spellEnd"/>
+      <w:r>
+        <w:t xml:space="preserve">, situated in Nepal’s </w:t>
+      </w:r>
+      <w:proofErr w:type="spellStart"/>
+      <w:r>
+        <w:t>Gorkha</w:t>
+      </w:r>
+      <w:proofErr w:type="spellEnd"/>
+      <w:r>
+        <w:t xml:space="preserve"> District within the </w:t>
+      </w:r>
+      <w:proofErr w:type="spellStart"/>
+      <w:r>
+        <w:t>Manaslu</w:t>
+      </w:r>
+      <w:proofErr w:type="spellEnd"/>
+      <w:r>
+        <w:t xml:space="preserve"> Conservation Area (1,663 km²), presents unique challenges for sustainable mountaineering operations. With 374 summit permits issued in 2025 and increasing annual traffic, the mountain faces growing environmental pressure from expedition waste accumulation at high-altitude camps. Traditional waste recovery methods rely exclusively on human porterage, presenting significant safety and logistical challenges in terrain with a historical fatality rate of approximately 9%.</w:t>
+      </w:r>
+    </w:p>
+    <w:p/>
+    <w:p>
+      <w:r>
+        <w:t>2.2</w:t>
+      </w:r>
+      <w:r>
+        <w:tab/>
+        <w:t>Strategic Objectives</w:t>
+      </w:r>
+    </w:p>
+    <w:p>
+      <w:r>
+        <w:t>•</w:t>
+      </w:r>
+      <w:r>
+        <w:tab/>
+        <w:t>Primary Objective: Establish and validate FC30 drone delivery protocols between Base Camp (4,800 m) and Camp 1 (5,800 m), creating a replicable route for full-scale operations from the 2026 season.</w:t>
+      </w:r>
+    </w:p>
+    <w:p>
+      <w:r>
+        <w:t>•</w:t>
+      </w:r>
+      <w:r>
+        <w:tab/>
+        <w:t xml:space="preserve">Geospatial Intelligence: Generate high-resolution </w:t>
+      </w:r>
+      <w:proofErr w:type="spellStart"/>
+      <w:r>
+        <w:t>orthomosaics</w:t>
+      </w:r>
+      <w:proofErr w:type="spellEnd"/>
+      <w:r>
+        <w:t xml:space="preserve"> and 3D models of Base Camp, </w:t>
+      </w:r>
+      <w:proofErr w:type="spellStart"/>
+      <w:r>
+        <w:t>Birendra</w:t>
+      </w:r>
+      <w:proofErr w:type="spellEnd"/>
+      <w:r>
+        <w:t xml:space="preserve"> Lake catchment, and glacial periphery for environmental monitoring and operational planning.</w:t>
+      </w:r>
+    </w:p>
+    <w:p>
+      <w:r>
+        <w:t>•</w:t>
+      </w:r>
+      <w:r>
+        <w:tab/>
+        <w:t xml:space="preserve">Feasibility Analysis: Assess drone delivery viability for agricultural transport from </w:t>
+      </w:r>
+      <w:proofErr w:type="spellStart"/>
+      <w:r>
+        <w:t>Nubri</w:t>
+      </w:r>
+      <w:proofErr w:type="spellEnd"/>
+      <w:r>
+        <w:t xml:space="preserve"> Valley apple farms (</w:t>
+      </w:r>
+      <w:proofErr w:type="spellStart"/>
+      <w:r>
+        <w:t>Namrung</w:t>
+      </w:r>
+      <w:proofErr w:type="spellEnd"/>
+      <w:r>
+        <w:t xml:space="preserve"> and </w:t>
+      </w:r>
+      <w:proofErr w:type="spellStart"/>
+      <w:r>
+        <w:t>Lho</w:t>
+      </w:r>
+      <w:proofErr w:type="spellEnd"/>
+      <w:r>
+        <w:t>) to support local economic development.</w:t>
+      </w:r>
+    </w:p>
+    <w:p>
+      <w:r>
+        <w:t>•</w:t>
+      </w:r>
+      <w:r>
+        <w:tab/>
+        <w:t>Climatological Documentation: Document micro-weather patterns and gather indigenous knowledge from Sherpa communities regarding observable climate change impacts.</w:t>
+      </w:r>
+    </w:p>
+    <w:p/>
+    <w:p>
+      <w:r>
+        <w:t>3</w:t>
+      </w:r>
+      <w:r>
+        <w:tab/>
+        <w:t>Methodology &amp; Field Operations</w:t>
+      </w:r>
+    </w:p>
+    <w:p>
+      <w:r>
+        <w:t>3.1</w:t>
+      </w:r>
+      <w:r>
+        <w:tab/>
+        <w:t>Technical Framework</w:t>
+      </w:r>
+    </w:p>
+    <w:p>
+      <w:r>
+        <w:t>Table 1: Technical Specifications</w:t>
+      </w:r>
+    </w:p>
+    <w:p>
+      <w:r>
+        <w:lastRenderedPageBreak/>
+        <w:t>Component</w:t>
+      </w:r>
+      <w:r>
+        <w:tab/>
+        <w:t>Specifications</w:t>
+      </w:r>
+      <w:r>
+        <w:tab/>
+        <w:t>Purpose</w:t>
+      </w:r>
+    </w:p>
+    <w:p>
+      <w:r>
+        <w:t>Platform</w:t>
+      </w:r>
+      <w:r>
+        <w:tab/>
+        <w:t>DJI Fly Cart 30 (FC30)</w:t>
+      </w:r>
+      <w:r>
+        <w:tab/>
+        <w:t>Cargo transport and delivery testing</w:t>
+      </w:r>
+    </w:p>
+    <w:p>
+      <w:r>
+        <w:t>Mapping System</w:t>
+      </w:r>
+      <w:r>
+        <w:tab/>
+        <w:t>DJI M3E photogrammetry suite</w:t>
+      </w:r>
+      <w:r>
+        <w:tab/>
+        <w:t>High-resolution terrain mapping</w:t>
+      </w:r>
+    </w:p>
+    <w:p>
+      <w:r>
+        <w:t>Processing Software</w:t>
+      </w:r>
+      <w:r>
+        <w:tab/>
+        <w:t>DJI Terra &amp; DJI Modify</w:t>
+      </w:r>
+      <w:r>
+        <w:tab/>
+        <w:t>Data processing and 3D model generation</w:t>
+      </w:r>
+    </w:p>
+    <w:p>
+      <w:r>
+        <w:t>Team Composition</w:t>
+      </w:r>
+      <w:r>
+        <w:tab/>
+        <w:t>6-member technical team</w:t>
+      </w:r>
+      <w:r>
+        <w:tab/>
+        <w:t>Field operations and data collection</w:t>
+      </w:r>
+    </w:p>
+    <w:p>
+      <w:r>
+        <w:t>Deployment Duration</w:t>
+      </w:r>
+      <w:r>
+        <w:tab/>
+        <w:t>24 days (Sept 4–27, 2025)</w:t>
+      </w:r>
+      <w:r>
+        <w:tab/>
+        <w:t>Continuous field assessment</w:t>
+      </w:r>
+    </w:p>
+    <w:p/>
+    <w:p>
+      <w:r>
+        <w:t>3.2</w:t>
+      </w:r>
+      <w:r>
+        <w:tab/>
+        <w:t>Operational Sites</w:t>
+      </w:r>
+    </w:p>
+    <w:p>
+      <w:r>
+        <w:t>Table 2: Site-Specific Operations</w:t>
+      </w:r>
+    </w:p>
+    <w:p>
+      <w:r>
+        <w:t>Location</w:t>
+      </w:r>
+      <w:r>
+        <w:tab/>
+        <w:t>Elevation</w:t>
+      </w:r>
+      <w:r>
+        <w:tab/>
+        <w:t>Primary Purpose</w:t>
+      </w:r>
+      <w:r>
+        <w:tab/>
+        <w:t>Key Deliverables</w:t>
+      </w:r>
+    </w:p>
+    <w:p>
+      <w:proofErr w:type="spellStart"/>
+      <w:r>
+        <w:t>Manaslu</w:t>
+      </w:r>
+      <w:proofErr w:type="spellEnd"/>
+      <w:r>
+        <w:t xml:space="preserve"> Base Camp</w:t>
+      </w:r>
+      <w:r>
+        <w:tab/>
+        <w:t>4,800 m</w:t>
+      </w:r>
+      <w:r>
+        <w:tab/>
+        <w:t>Logistics hub establishment</w:t>
+      </w:r>
+      <w:r>
+        <w:tab/>
+        <w:t>3D terrain model, DEM</w:t>
+      </w:r>
+    </w:p>
+    <w:p>
+      <w:proofErr w:type="spellStart"/>
+      <w:r>
+        <w:t>Birendra</w:t>
+      </w:r>
+      <w:proofErr w:type="spellEnd"/>
+      <w:r>
+        <w:t xml:space="preserve"> Lake Catchment</w:t>
+      </w:r>
+      <w:r>
+        <w:tab/>
+        <w:t>4,850 m</w:t>
+      </w:r>
+      <w:r>
+        <w:tab/>
+        <w:t>Hydrological mapping</w:t>
+      </w:r>
+      <w:r>
+        <w:tab/>
+      </w:r>
+      <w:proofErr w:type="spellStart"/>
+      <w:r>
+        <w:t>Orthomosaic</w:t>
+      </w:r>
+      <w:proofErr w:type="spellEnd"/>
+      <w:r>
+        <w:t>, watershed analysis</w:t>
+      </w:r>
+    </w:p>
+    <w:p>
+      <w:proofErr w:type="spellStart"/>
+      <w:r>
+        <w:t>Namrung</w:t>
+      </w:r>
+      <w:proofErr w:type="spellEnd"/>
+      <w:r>
+        <w:t xml:space="preserve"> Apple Farm</w:t>
+      </w:r>
+      <w:r>
+        <w:tab/>
+        <w:t>2,630 m</w:t>
+      </w:r>
+      <w:r>
+        <w:tab/>
+        <w:t>Agricultural feasibility study</w:t>
+      </w:r>
+      <w:r>
+        <w:tab/>
+        <w:t>Georeferenced imagery, route analysis</w:t>
+      </w:r>
+    </w:p>
+    <w:p>
+      <w:proofErr w:type="spellStart"/>
+      <w:r>
+        <w:t>Lho</w:t>
+      </w:r>
+      <w:proofErr w:type="spellEnd"/>
+      <w:r>
+        <w:t xml:space="preserve"> </w:t>
+      </w:r>
+      <w:r>
+        <w:t xml:space="preserve">Apple Farm </w:t>
+      </w:r>
+      <w:r>
+        <w:tab/>
+        <w:t>3,180 m</w:t>
+      </w:r>
+      <w:r>
+        <w:tab/>
+        <w:t>Route op</w:t>
+      </w:r>
+      <w:r>
+        <w:t>timization</w:t>
+      </w:r>
+      <w:r>
+        <w:tab/>
+        <w:t>Topographic mapping</w:t>
+      </w:r>
+    </w:p>
+    <w:p>
+      <w:r>
+        <w:t>Potential Relay Point</w:t>
+      </w:r>
+      <w:r>
+        <w:tab/>
+        <w:t>~6,000 m</w:t>
+      </w:r>
+      <w:r>
+        <w:tab/>
+        <w:t>Communications assessment</w:t>
+      </w:r>
+      <w:r>
+        <w:tab/>
+        <w:t>Line-of-sight verification tables</w:t>
+      </w:r>
+    </w:p>
+    <w:p>
+      <w:proofErr w:type="spellStart"/>
+      <w:r>
+        <w:t>Samagaun</w:t>
+      </w:r>
+      <w:proofErr w:type="spellEnd"/>
+      <w:r>
+        <w:t xml:space="preserve"> Village</w:t>
+      </w:r>
+      <w:r>
+        <w:tab/>
+        <w:t>3,530 m</w:t>
+      </w:r>
+      <w:r>
+        <w:tab/>
+        <w:t>Community infrastructure mapping</w:t>
+      </w:r>
+      <w:r>
+        <w:tab/>
+      </w:r>
+      <w:proofErr w:type="spellStart"/>
+      <w:r>
+        <w:t>Orthomosaic</w:t>
+      </w:r>
+      <w:proofErr w:type="spellEnd"/>
+      <w:r>
+        <w:t>, 3D model</w:t>
+      </w:r>
+    </w:p>
+    <w:p/>
+    <w:p>
+      <w:r>
+        <w:t>3.3</w:t>
+      </w:r>
+      <w:r>
+        <w:tab/>
+        <w:t>Data Collection Protocol</w:t>
+      </w:r>
+    </w:p>
+    <w:p>
+      <w:r>
+        <w:t>1.</w:t>
+      </w:r>
+      <w:r>
+        <w:tab/>
+        <w:t>Pre-mission Planning: Waypoint establishment and flight path simulation using existing topographic data.</w:t>
+      </w:r>
+    </w:p>
+    <w:p>
+      <w:r>
+        <w:t>2.</w:t>
+      </w:r>
+      <w:r>
+        <w:tab/>
+        <w:t>In-situ Verification: Real-time weather monitoring (wind speed, temperature, visibility) and GNSS stability assessment at 30-minute intervals.</w:t>
+      </w:r>
+    </w:p>
+    <w:p>
+      <w:r>
+        <w:t>3.</w:t>
+      </w:r>
+      <w:r>
+        <w:tab/>
+        <w:t>Multi-sensor Deployment: Simultaneous collection of visual (RGB), positional (GPS/GLONASS), and meteorological data across all operational sites.</w:t>
+      </w:r>
+    </w:p>
+    <w:p>
+      <w:r>
+        <w:t>4.</w:t>
+      </w:r>
+      <w:r>
+        <w:tab/>
+        <w:t>Stakeholder Engagement: Structured interviews with 14 local guides and climbing personnel regarding weather patterns and observed environmental changes.</w:t>
+      </w:r>
+    </w:p>
+    <w:p/>
+    <w:p>
+      <w:r>
+        <w:t>4</w:t>
+      </w:r>
+      <w:r>
+        <w:tab/>
+        <w:t>Key Findings &amp; Technical Analysis</w:t>
+      </w:r>
+    </w:p>
+    <w:p>
+      <w:r>
+        <w:t>4.1</w:t>
+      </w:r>
+      <w:r>
+        <w:tab/>
+        <w:t>Environmental Constraints</w:t>
+      </w:r>
+    </w:p>
+    <w:p>
+      <w:r>
+        <w:lastRenderedPageBreak/>
+        <w:t>•</w:t>
+      </w:r>
+      <w:r>
+        <w:tab/>
+        <w:t>Topographic Variation: 350 m elevation differential within Base Camp perimeter, creating multiple microclimates.</w:t>
+      </w:r>
+    </w:p>
+    <w:p>
+      <w:r>
+        <w:t>•</w:t>
+      </w:r>
+      <w:r>
+        <w:tab/>
+        <w:t xml:space="preserve">Meteorological Instability: Rapid fog formation from </w:t>
+      </w:r>
+      <w:proofErr w:type="spellStart"/>
+      <w:r>
+        <w:t>Birendra</w:t>
+      </w:r>
+      <w:proofErr w:type="spellEnd"/>
+      <w:r>
+        <w:t xml:space="preserve"> Lake basin with onset times of 5–15 minutes, reducing operational windows by 60%.</w:t>
+      </w:r>
+    </w:p>
+    <w:p>
+      <w:r>
+        <w:t>•</w:t>
+      </w:r>
+      <w:r>
+        <w:tab/>
+        <w:t>Wind Patterns: Maximum gusts of 8 m/s recorded at base level (using M3E) versus relative calm (0–3 m/s) at higher camps, indicating inverted wind patterns.</w:t>
+      </w:r>
+    </w:p>
+    <w:p>
+      <w:r>
+        <w:t>•</w:t>
+      </w:r>
+      <w:r>
+        <w:tab/>
+        <w:t>Operational Window: Optimal conditions limited to 2–4 hours daily (typically 0900–1300 local time).</w:t>
+      </w:r>
+    </w:p>
+    <w:p/>
+    <w:p>
+      <w:r>
+        <w:t>4.2</w:t>
+      </w:r>
+      <w:r>
+        <w:tab/>
+        <w:t>Communications Infrastructure</w:t>
+      </w:r>
+    </w:p>
+    <w:p>
+      <w:r>
+        <w:t>•</w:t>
+      </w:r>
+      <w:r>
+        <w:tab/>
+        <w:t>Direct Line-of-Sight: Absent between Base Camp and Camp 1 due to intervening ridge formations.</w:t>
+      </w:r>
+    </w:p>
+    <w:p>
+      <w:r>
+        <w:t>•</w:t>
+      </w:r>
+      <w:r>
+        <w:tab/>
+        <w:t xml:space="preserve">Alternative Relay Site: Identified at approximately 6,000 m elevation </w:t>
+      </w:r>
+      <w:proofErr w:type="gramStart"/>
+      <w:r>
+        <w:t>(</w:t>
+      </w:r>
+      <w:r>
+        <w:t xml:space="preserve"> hike</w:t>
+      </w:r>
+      <w:proofErr w:type="gramEnd"/>
+      <w:r>
+        <w:t xml:space="preserve"> of </w:t>
+      </w:r>
+      <w:r>
+        <w:t>2-hour ascent from Camp 1) providing 85% visibility coverage.</w:t>
+      </w:r>
+    </w:p>
+    <w:p>
+      <w:r>
+        <w:t>•</w:t>
+      </w:r>
+      <w:r>
+        <w:tab/>
+        <w:t>Upper Camp Visibility: Clear transmission paths confirmed to Camps 2 and 3 from Base Camp with 95% signal reliability.</w:t>
+      </w:r>
+    </w:p>
+    <w:p>
+      <w:r>
+        <w:t>•</w:t>
+      </w:r>
+      <w:r>
+        <w:tab/>
+        <w:t xml:space="preserve">Local Infrastructure: Mini-hydropower facility operated by </w:t>
+      </w:r>
+      <w:proofErr w:type="spellStart"/>
+      <w:r>
+        <w:t>ImagineNepal</w:t>
+      </w:r>
+      <w:proofErr w:type="spellEnd"/>
+      <w:r>
+        <w:t xml:space="preserve"> Club provided limited power availability for equipment charging.</w:t>
+      </w:r>
+    </w:p>
+    <w:p/>
+    <w:p>
+      <w:r>
+        <w:t>4.3</w:t>
+      </w:r>
+      <w:r>
+        <w:tab/>
+        <w:t>Geospatial Deliverables</w:t>
+      </w:r>
+    </w:p>
+    <w:p>
+      <w:r>
+        <w:t>•</w:t>
+      </w:r>
+      <w:r>
+        <w:tab/>
+        <w:t>Coverage Area: 5.5 km² of high-resolution terrain data processed and analyzed.</w:t>
+      </w:r>
+    </w:p>
+    <w:p>
+      <w:r>
+        <w:t>•</w:t>
+      </w:r>
+      <w:r>
+        <w:tab/>
+        <w:t>Output Specifications:</w:t>
+      </w:r>
+    </w:p>
+    <w:p>
+      <w:r>
+        <w:t xml:space="preserve">   </w:t>
+      </w:r>
+      <w:proofErr w:type="gramStart"/>
+      <w:r>
+        <w:t>o</w:t>
+      </w:r>
+      <w:proofErr w:type="gramEnd"/>
+      <w:r>
+        <w:tab/>
+        <w:t>Point cloud density: 50–100 points/m²</w:t>
+      </w:r>
+    </w:p>
+    <w:p>
+      <w:r>
+        <w:t xml:space="preserve">   </w:t>
+      </w:r>
+      <w:proofErr w:type="gramStart"/>
+      <w:r>
+        <w:t>o</w:t>
+      </w:r>
+      <w:proofErr w:type="gramEnd"/>
+      <w:r>
+        <w:tab/>
+      </w:r>
+      <w:proofErr w:type="spellStart"/>
+      <w:r>
+        <w:t>Orthomosaic</w:t>
+      </w:r>
+      <w:proofErr w:type="spellEnd"/>
+      <w:r>
+        <w:t xml:space="preserve"> resolution: 5 cm/pixel</w:t>
+      </w:r>
+    </w:p>
+    <w:p>
+      <w:r>
+        <w:t xml:space="preserve">   </w:t>
+      </w:r>
+      <w:proofErr w:type="gramStart"/>
+      <w:r>
+        <w:t>o</w:t>
+      </w:r>
+      <w:proofErr w:type="gramEnd"/>
+      <w:r>
+        <w:tab/>
+        <w:t>Digital Elevation Model (DEM) accuracy: ±15 cm vertical</w:t>
+      </w:r>
+    </w:p>
+    <w:p>
+      <w:r>
+        <w:t>•</w:t>
+      </w:r>
+      <w:r>
+        <w:tab/>
+        <w:t>Processed Assets:</w:t>
+      </w:r>
+    </w:p>
+    <w:p>
+      <w:r>
+        <w:t xml:space="preserve">   </w:t>
+      </w:r>
+      <w:proofErr w:type="gramStart"/>
+      <w:r>
+        <w:t>o</w:t>
+      </w:r>
+      <w:proofErr w:type="gramEnd"/>
+      <w:r>
+        <w:tab/>
+        <w:t>Glacier retreat baseline measurements (2025 benchmark established)</w:t>
+      </w:r>
+    </w:p>
+    <w:p>
+      <w:r>
+        <w:t xml:space="preserve">   </w:t>
+      </w:r>
+      <w:proofErr w:type="gramStart"/>
+      <w:r>
+        <w:t>o</w:t>
+      </w:r>
+      <w:proofErr w:type="gramEnd"/>
+      <w:r>
+        <w:tab/>
+        <w:t>Base Camp infrastructure planning models with hazard zone identification</w:t>
+      </w:r>
+    </w:p>
+    <w:p>
+      <w:r>
+        <w:t xml:space="preserve">   </w:t>
+      </w:r>
+      <w:proofErr w:type="gramStart"/>
+      <w:r>
+        <w:t>o</w:t>
+      </w:r>
+      <w:proofErr w:type="gramEnd"/>
+      <w:r>
+        <w:tab/>
+        <w:t>Avalanche path mapping and risk assessment visualization</w:t>
+      </w:r>
+    </w:p>
+    <w:p>
+      <w:r>
+        <w:t xml:space="preserve">   </w:t>
+      </w:r>
+      <w:proofErr w:type="gramStart"/>
+      <w:r>
+        <w:t>o</w:t>
+      </w:r>
+      <w:proofErr w:type="gramEnd"/>
+      <w:r>
+        <w:tab/>
+        <w:t xml:space="preserve">Hydrological flow analysis for </w:t>
+      </w:r>
+      <w:proofErr w:type="spellStart"/>
+      <w:r>
+        <w:t>Birendra</w:t>
+      </w:r>
+      <w:proofErr w:type="spellEnd"/>
+      <w:r>
+        <w:t xml:space="preserve"> Lake catchment area</w:t>
+      </w:r>
+    </w:p>
+    <w:p/>
+    <w:p>
+      <w:r>
+        <w:t>5</w:t>
+      </w:r>
+      <w:r>
+        <w:tab/>
+        <w:t>Technical Limitations &amp; Lessons Learned</w:t>
+      </w:r>
+    </w:p>
+    <w:p>
+      <w:r>
+        <w:t>5.1</w:t>
+      </w:r>
+      <w:r>
+        <w:tab/>
+        <w:t>System Constraints Encountered</w:t>
+      </w:r>
+    </w:p>
+    <w:p>
+      <w:r>
+        <w:lastRenderedPageBreak/>
+        <w:t>1.</w:t>
+      </w:r>
+      <w:r>
+        <w:tab/>
+        <w:t>GNSS Reliability: Intermittent satellite connectivity above 5,000 m with frequent loss of 5+ satellite lock required for precision operations.</w:t>
+      </w:r>
+    </w:p>
+    <w:p>
+      <w:r>
+        <w:t>2.</w:t>
+      </w:r>
+      <w:r>
+        <w:tab/>
+        <w:t>Sensor Performance: Barometric altimeter instability (±50 m variance) and IMU drift in low-pressure, low-temperature environments.</w:t>
+      </w:r>
+    </w:p>
+    <w:p>
+      <w:r>
+        <w:t>3.</w:t>
+      </w:r>
+      <w:r>
+        <w:tab/>
+        <w:t>Thermal Management: Battery efficiency degradatio</w:t>
+      </w:r>
+      <w:r>
+        <w:t xml:space="preserve">n </w:t>
+      </w:r>
+      <w:proofErr w:type="gramStart"/>
+      <w:r>
+        <w:t xml:space="preserve">below  </w:t>
+      </w:r>
+      <w:r>
+        <w:t>15</w:t>
+      </w:r>
+      <w:proofErr w:type="gramEnd"/>
+      <w:r>
+        <w:t>°C despite insulation, reducing effective flight time by 40%.</w:t>
+      </w:r>
+    </w:p>
+    <w:p>
+      <w:r>
+        <w:t>4.</w:t>
+      </w:r>
+      <w:r>
+        <w:tab/>
+        <w:t>Payload Optimization: Required altitude-density effect recalculations, with actual lift capacity 25% below sea-level specifications at 5,800 m.</w:t>
+      </w:r>
+    </w:p>
+    <w:p/>
+    <w:p>
+      <w:r>
+        <w:t>5.2</w:t>
+      </w:r>
+      <w:r>
+        <w:tab/>
+        <w:t>Operational Adaptations</w:t>
+      </w:r>
+    </w:p>
+    <w:p>
+      <w:r>
+        <w:t>•</w:t>
+      </w:r>
+      <w:r>
+        <w:tab/>
+        <w:t>Positioning Systems: Implemented redundant GPS/GLONASS/Galileo constellation monitoring with ground-based verification points.</w:t>
+      </w:r>
+    </w:p>
+    <w:p>
+      <w:r>
+        <w:t>•</w:t>
+      </w:r>
+      <w:r>
+        <w:tab/>
+        <w:t>Weather Monitoring: Established three micro-weather stations at 500 m elevation intervals for gradient analysis.</w:t>
+      </w:r>
+    </w:p>
+    <w:p>
+      <w:r>
+        <w:t>•</w:t>
+      </w:r>
+      <w:r>
+        <w:tab/>
+        <w:t>Payload Calibration: Developed altitude-specific payload calibration tables (0–6,000 m in 500 m increments).</w:t>
+      </w:r>
+    </w:p>
+    <w:p>
+      <w:r>
+        <w:t>•</w:t>
+      </w:r>
+      <w:r>
+        <w:tab/>
+        <w:t>Relay Architecture: Designed modular relay station deployment strategy using identified high-visibility points.</w:t>
+      </w:r>
+    </w:p>
+    <w:p/>
+    <w:p>
+      <w:r>
+        <w:t>6</w:t>
+      </w:r>
+      <w:r>
+        <w:tab/>
+        <w:t>Strategic Implications &amp; Future Trajectory</w:t>
+      </w:r>
+    </w:p>
+    <w:p>
+      <w:r>
+        <w:t>6.1</w:t>
+      </w:r>
+      <w:r>
+        <w:tab/>
+        <w:t>Immediate Applications (2026 Season)</w:t>
+      </w:r>
+    </w:p>
+    <w:p>
+      <w:r>
+        <w:t>•</w:t>
+      </w:r>
+      <w:r>
+        <w:tab/>
+        <w:t>Expedition Planning: 12 optimized flight paths established with alternative routing protocols.</w:t>
+      </w:r>
+    </w:p>
+    <w:p>
+      <w:r>
+        <w:t>•</w:t>
+      </w:r>
+      <w:r>
+        <w:tab/>
+        <w:t>Risk Mitigation: 15 identified hazard zones mapped (avalanche/crevasse) with recommended avoidance corridors.</w:t>
+      </w:r>
+    </w:p>
+    <w:p>
+      <w:r>
+        <w:t>•</w:t>
+      </w:r>
+      <w:r>
+        <w:tab/>
+        <w:t xml:space="preserve">Community Development: Apple transport feasibility report delivered to </w:t>
+      </w:r>
+      <w:proofErr w:type="spellStart"/>
+      <w:r>
+        <w:t>Nubri</w:t>
+      </w:r>
+      <w:proofErr w:type="spellEnd"/>
+      <w:r>
+        <w:t xml:space="preserve"> Valley agricultural cooperatives with three proposed delivery routes.</w:t>
+      </w:r>
+    </w:p>
+    <w:p>
+      <w:r>
+        <w:t>•</w:t>
+      </w:r>
+      <w:r>
+        <w:tab/>
+        <w:t xml:space="preserve">Regulatory Compliance: All operations conducted within </w:t>
+      </w:r>
+      <w:proofErr w:type="spellStart"/>
+      <w:r>
+        <w:t>Manaslu</w:t>
+      </w:r>
+      <w:proofErr w:type="spellEnd"/>
+      <w:r>
+        <w:t xml:space="preserve"> Conservation Area Project (MCAP) and National Trust for Nature Conservation (NTNC) guidelines.</w:t>
+      </w:r>
+    </w:p>
+    <w:p/>
+    <w:p>
+      <w:r>
+        <w:t>6.2</w:t>
+      </w:r>
+      <w:r>
+        <w:tab/>
+        <w:t>Long-term Institutional Value</w:t>
+      </w:r>
+    </w:p>
+    <w:p>
+      <w:r>
+        <w:t>1.</w:t>
+      </w:r>
+      <w:r>
+        <w:tab/>
+        <w:t>Climate Monitoring: Baseline established for annual glacial retreat measurement and comparative analysis.</w:t>
+      </w:r>
+    </w:p>
+    <w:p>
+      <w:r>
+        <w:t>2.</w:t>
+      </w:r>
+      <w:r>
+        <w:tab/>
+        <w:t>Safety Protocols: Developed first high-altitude drone operations manual for Himalayan conditions, submitted to Department of Tourism (DoT) for review.</w:t>
+      </w:r>
+    </w:p>
+    <w:p>
+      <w:r>
+        <w:t>3.</w:t>
+      </w:r>
+      <w:r>
+        <w:tab/>
+        <w:t>Technology Development: Identified 7 specific hardware modifications for extreme-altitude operations (prioritizing GNSS, thermal regulation, and sensor hardening).</w:t>
+      </w:r>
+    </w:p>
+    <w:p>
+      <w:r>
+        <w:lastRenderedPageBreak/>
+        <w:t>4.</w:t>
+      </w:r>
+      <w:r>
+        <w:tab/>
+        <w:t>Policy Framework: Contributed to Nepal’s developing regulatory framework for autonomous mountain logistics through documented field data.</w:t>
+      </w:r>
+    </w:p>
+    <w:p>
+      <w:r>
+        <w:t>5.</w:t>
+      </w:r>
+      <w:r>
+        <w:tab/>
+        <w:t>Knowledge Preservation: Digitized indigenous observations of environmental change from Sherpa interviews for archival and research purposes.</w:t>
+      </w:r>
+    </w:p>
+    <w:p/>
+    <w:p>
+      <w:r>
+        <w:t>7</w:t>
+      </w:r>
+      <w:r>
+        <w:tab/>
+        <w:t>Conclusion</w:t>
+      </w:r>
+    </w:p>
+    <w:p>
+      <w:r>
+        <w:t>The Airlift Kailas Cleanup Campaign successfully transitioned high-altitude drone logistics from experimental phase to systematic field deployment. While waste transport operations were deferred pending technical refinements, the expedition achieved its broader objective of creating a replicable model for extreme-environment reconnaissance and system validation.</w:t>
+      </w:r>
+    </w:p>
+    <w:p/>
+    <w:p>
+      <w:r>
+        <w:t>The comprehensive datasets and operational protocols generated represent significant advancements in multiple domains:</w:t>
+      </w:r>
+    </w:p>
+    <w:p>
+      <w:r>
+        <w:t>•</w:t>
+      </w:r>
+      <w:r>
+        <w:tab/>
+        <w:t>Sustainable Mountain Management: Providing data-driven solutions for waste management in sensitive alpine ecosystems</w:t>
+      </w:r>
+    </w:p>
+    <w:p>
+      <w:r>
+        <w:t>•</w:t>
+      </w:r>
+      <w:r>
+        <w:tab/>
+        <w:t>Climate Change Documentation: Establishing quantitative benchmarks for glacial and hydrological monitoring</w:t>
+      </w:r>
+    </w:p>
+    <w:p>
+      <w:r>
+        <w:t>•</w:t>
+      </w:r>
+      <w:r>
+        <w:tab/>
+        <w:t>Community Economic Development: Demonstrating appropriate technology applications for remote region supply chains</w:t>
+      </w:r>
+    </w:p>
+    <w:p>
+      <w:r>
+        <w:t>•</w:t>
+      </w:r>
+      <w:r>
+        <w:tab/>
+        <w:t>Autonomous Systems Deployment: Advancing operational knowledge in GPS-denied, environ</w:t>
+      </w:r>
+      <w:r>
+        <w:t>mentally extreme conditions</w:t>
+      </w:r>
+      <w:r>
+        <w:t>.</w:t>
+      </w:r>
+    </w:p>
+    <w:p/>
+    <w:p>
+      <w:r>
+        <w:t>This campaign confirms that while technical challenges remain significant, the integration of autonomous systems into high-altitude conservation and logistics operations is both feasible and necessary for sustainable Himalayan management.</w:t>
+      </w:r>
+    </w:p>
+    <w:p>
+      <w:r>
+        <w:t>Use the image suitably to make the page looking attractive and also add this project to the highlighted projects.</w:t>
+      </w:r>
+    </w:p>
+    <w:p>
+      <w:r>
+        <w:t>—END OF REPORT—</w:t>
+      </w:r>
+    </w:p>
+    <w:p/>
+    <w:p/>
+    <w:p/>
+    <w:p/>
+    <w:p/>
+    <w:p/>
+    <w:p/>
+    <w:p/>
+    <w:p>
+      <w:r>
+        <w:lastRenderedPageBreak/>
+        <w:t xml:space="preserve">Make a system to upload the projects, achievements and </w:t>
+      </w:r>
+      <w:proofErr w:type="spellStart"/>
+      <w:r>
+        <w:t>eca</w:t>
+      </w:r>
+      <w:proofErr w:type="spellEnd"/>
+      <w:r>
+        <w:t xml:space="preserve"> </w:t>
+      </w:r>
+      <w:proofErr w:type="spellStart"/>
+      <w:r>
+        <w:t>datas</w:t>
+      </w:r>
+      <w:proofErr w:type="spellEnd"/>
+      <w:r>
+        <w:t xml:space="preserve"> from the pdf/word file, the word file contains the details about the specific project, the related images and the details. The page open with “</w:t>
+      </w:r>
+      <w:proofErr w:type="spellStart"/>
+      <w:r>
+        <w:t>shradaya</w:t>
+      </w:r>
+      <w:proofErr w:type="spellEnd"/>
+      <w:r>
+        <w:t>-raj-</w:t>
+      </w:r>
+      <w:proofErr w:type="spellStart"/>
+      <w:r>
+        <w:t>mero</w:t>
+      </w:r>
+      <w:proofErr w:type="spellEnd"/>
+      <w:r>
+        <w:t xml:space="preserve">-update” as page name on the search tab address which is only accessible by </w:t>
+      </w:r>
+      <w:proofErr w:type="spellStart"/>
+      <w:r>
+        <w:t>wirting</w:t>
+      </w:r>
+      <w:proofErr w:type="spellEnd"/>
+      <w:r>
+        <w:t xml:space="preserve"> the address on the tab. </w:t>
+      </w:r>
+      <w:r>
+        <w:br/>
+        <w:t>the system should automatically add the project in a great visually appealing form and added to the respected location.</w:t>
+      </w:r>
+      <w:r>
+        <w:br/>
+      </w:r>
+      <w:proofErr w:type="gramStart"/>
+      <w:r>
+        <w:t>the</w:t>
+      </w:r>
+      <w:proofErr w:type="gramEnd"/>
+      <w:r>
+        <w:t xml:space="preserve"> details can be highlighted as featured or normal such that the projects will be placed accordingly in the page and updated.</w:t>
+      </w:r>
+      <w:r>
+        <w:br/>
+      </w:r>
+      <w:proofErr w:type="gramStart"/>
+      <w:r>
+        <w:t>in</w:t>
+      </w:r>
+      <w:proofErr w:type="gramEnd"/>
+      <w:r>
+        <w:t xml:space="preserve"> individual </w:t>
+      </w:r>
+      <w:proofErr w:type="spellStart"/>
+      <w:r>
+        <w:t>hirerachy</w:t>
+      </w:r>
+      <w:proofErr w:type="spellEnd"/>
+      <w:r>
+        <w:t xml:space="preserve"> list the project as, newer one at first and the past one as on back of the list based on the date mentioned by me for each project or detail. Also has the space to upload the image that will place the image base on their name and place logically.</w:t>
+      </w:r>
+      <w:r>
+        <w:br/>
+      </w:r>
+      <w:proofErr w:type="gramStart"/>
+      <w:r>
+        <w:t>the</w:t>
+      </w:r>
+      <w:proofErr w:type="gramEnd"/>
+      <w:r>
+        <w:t xml:space="preserve"> main aim of mine is to updated the website</w:t>
+      </w:r>
+      <w:bookmarkStart w:id="0" w:name="_GoBack"/>
+      <w:bookmarkEnd w:id="0"/>
+      <w:r>
+        <w:t xml:space="preserve"> without any  great effort in future.</w:t>
+      </w:r>
+    </w:p>
+    <w:p>
+      <w:r>
+        <w:t xml:space="preserve"> </w:t>
+      </w:r>
+    </w:p>
     <w:sectPr>
-      <w:pgSz w:w="12240" w:h="15840"/>
+      <w:pgSz w:w="11906" w:h="16838" w:code="9"/>
       <w:pgMar w:top="1440" w:right="1440" w:bottom="1440" w:left="1440" w:header="720" w:footer="720" w:gutter="0"/>
       <w:cols w:space="720"/>
       <w:docGrid w:linePitch="360"/>
@@ -3211,6 +7263,22 @@
       <w:szCs w:val="24"/>
     </w:rPr>
   </w:style>
+  <w:style w:type="paragraph" w:customStyle="1" w:styleId="Default">
+    <w:name w:val="Default"/>
+    <w:rsid w:val="000438E4"/>
+    <w:pPr>
+      <w:autoSpaceDE w:val="0"/>
+      <w:autoSpaceDN w:val="0"/>
+      <w:adjustRightInd w:val="0"/>
+      <w:spacing w:after="0" w:line="240" w:lineRule="auto"/>
+    </w:pPr>
+    <w:rPr>
+      <w:rFonts w:ascii="Times New Roman" w:hAnsi="Times New Roman" w:cs="Times New Roman"/>
+      <w:color w:val="000000"/>
+      <w:sz w:val="24"/>
+      <w:szCs w:val="24"/>
+    </w:rPr>
+  </w:style>
 </w:styles>
 </file>
 

</xml_diff>

<commit_message>
Update on March 31st
</commit_message>
<xml_diff>
--- a/Plan for the website.docx
+++ b/Plan for the website.docx
@@ -6467,17 +6467,406 @@
       </w:r>
       <w:proofErr w:type="gramEnd"/>
       <w:r>
-        <w:t xml:space="preserve"> main aim of mine is to updated the website</w:t>
+        <w:t xml:space="preserve"> main aim of mine is to updated the website without any  great effort in future.</w:t>
+      </w:r>
+    </w:p>
+    <w:p>
+      <w:r>
+        <w:t xml:space="preserve"> </w:t>
+      </w:r>
+    </w:p>
+    <w:p/>
+    <w:p>
+      <w:r>
+        <w:br w:type="page"/>
+      </w:r>
+    </w:p>
+    <w:p>
+      <w:pPr>
+        <w:rPr>
+          <w:b/>
+        </w:rPr>
+      </w:pPr>
+      <w:r>
+        <w:rPr>
+          <w:b/>
+        </w:rPr>
+        <w:lastRenderedPageBreak/>
+        <w:t>March 20, 2026</w:t>
+      </w:r>
+    </w:p>
+    <w:p>
+      <w:pPr>
+        <w:rPr>
+          <w:b/>
+        </w:rPr>
+      </w:pPr>
+      <w:r>
+        <w:rPr>
+          <w:b/>
+        </w:rPr>
+        <w:t>PHASE</w:t>
+      </w:r>
+      <w:proofErr w:type="gramStart"/>
+      <w:r>
+        <w:rPr>
+          <w:b/>
+        </w:rPr>
+        <w:t>:1</w:t>
+      </w:r>
+      <w:proofErr w:type="gramEnd"/>
+      <w:r>
+        <w:rPr>
+          <w:b/>
+        </w:rPr>
+        <w:t xml:space="preserve"> THE BASIC UPDATE INTO THE WEBSITE.</w:t>
+      </w:r>
+    </w:p>
+    <w:p>
+      <w:r>
+        <w:t>Home Page.</w:t>
+      </w:r>
+    </w:p>
+    <w:p>
+      <w:r>
+        <w:t>Management of the featured project</w:t>
+      </w:r>
+      <w:r>
+        <w:br/>
+        <w:t>Only the project that are mentioned as featured one has to be in the home page not all the projects that are uploaded into the sites</w:t>
+      </w:r>
+      <w:r>
+        <w:t>. Only the top three projects has to be mentioned as the featured projects.</w:t>
+      </w:r>
+    </w:p>
+    <w:p/>
+    <w:p>
+      <w:r>
+        <w:t>Project Page.</w:t>
+      </w:r>
+      <w:r>
+        <w:br/>
+      </w:r>
+    </w:p>
+    <w:p>
+      <w:r>
+        <w:t>When the project page is loaded the sliding section is good keep the featured project being updated, so the slider is not static although I add the new ima</w:t>
+      </w:r>
+      <w:r>
+        <w:t xml:space="preserve">ge as the featured </w:t>
+      </w:r>
+      <w:proofErr w:type="spellStart"/>
+      <w:r>
+        <w:t>project,update</w:t>
+      </w:r>
+      <w:proofErr w:type="spellEnd"/>
+      <w:r>
+        <w:t xml:space="preserve"> into the all places where the featured project are mentioned into the web.</w:t>
+      </w:r>
+    </w:p>
+    <w:p>
+      <w:r>
+        <w:t>All the listed project has to be mentioned based on the date performed. You can go through the year basis categorization. Change the color for the featured icon to green from yellow.</w:t>
+      </w:r>
+      <w:r>
+        <w:br/>
+      </w:r>
+      <w:r>
+        <w:br/>
+        <w:t xml:space="preserve">When I open the specific page of the project, can you change the back to home page button to more aesthetic and matching to the </w:t>
+      </w:r>
+      <w:proofErr w:type="gramStart"/>
+      <w:r>
+        <w:t>web</w:t>
+      </w:r>
+      <w:r>
+        <w:t>.</w:t>
+      </w:r>
+      <w:proofErr w:type="gramEnd"/>
+      <w:r>
+        <w:br/>
+        <w:t xml:space="preserve">When I open the image of the specific project, the opened image can’t be closed after I click </w:t>
+      </w:r>
+      <w:proofErr w:type="spellStart"/>
+      <w:r>
+        <w:t>else where</w:t>
+      </w:r>
+      <w:proofErr w:type="spellEnd"/>
+      <w:r>
+        <w:t xml:space="preserve"> on the screen from the image and the co</w:t>
+      </w:r>
+      <w:r>
+        <w:t>ntent being loaded and don’t keep those image .</w:t>
+      </w:r>
+      <w:proofErr w:type="spellStart"/>
+      <w:r>
+        <w:t>png</w:t>
+      </w:r>
+      <w:proofErr w:type="spellEnd"/>
+      <w:r>
+        <w:t xml:space="preserve">/jpg or </w:t>
+      </w:r>
+      <w:proofErr w:type="spellStart"/>
+      <w:r>
+        <w:t>anyother</w:t>
+      </w:r>
+      <w:proofErr w:type="spellEnd"/>
+      <w:r>
+        <w:t xml:space="preserve"> image </w:t>
+      </w:r>
+      <w:proofErr w:type="spellStart"/>
+      <w:r>
+        <w:t>image</w:t>
+      </w:r>
+      <w:proofErr w:type="spellEnd"/>
+      <w:r>
+        <w:t xml:space="preserve"> file into the page as shown here.</w:t>
+      </w:r>
+      <w:r>
+        <w:rPr>
+          <w:noProof/>
+        </w:rPr>
+        <w:t xml:space="preserve"> </w:t>
+      </w:r>
+    </w:p>
+    <w:p>
+      <w:r>
+        <w:drawing>
+          <wp:inline distT="0" distB="0" distL="0" distR="0" wp14:anchorId="3092D807" wp14:editId="0C764762">
+            <wp:extent cx="1203960" cy="839662"/>
+            <wp:effectExtent l="0" t="0" r="0" b="0"/>
+            <wp:docPr id="1" name="Picture 1"/>
+            <wp:cNvGraphicFramePr>
+              <a:graphicFrameLocks xmlns:a="http://schemas.openxmlformats.org/drawingml/2006/main" noChangeAspect="1"/>
+            </wp:cNvGraphicFramePr>
+            <a:graphic xmlns:a="http://schemas.openxmlformats.org/drawingml/2006/main">
+              <a:graphicData uri="http://schemas.openxmlformats.org/drawingml/2006/picture">
+                <pic:pic xmlns:pic="http://schemas.openxmlformats.org/drawingml/2006/picture">
+                  <pic:nvPicPr>
+                    <pic:cNvPr id="1" name=""/>
+                    <pic:cNvPicPr/>
+                  </pic:nvPicPr>
+                  <pic:blipFill>
+                    <a:blip r:embed="rId46"/>
+                    <a:stretch>
+                      <a:fillRect/>
+                    </a:stretch>
+                  </pic:blipFill>
+                  <pic:spPr>
+                    <a:xfrm>
+                      <a:off x="0" y="0"/>
+                      <a:ext cx="1229510" cy="857481"/>
+                    </a:xfrm>
+                    <a:prstGeom prst="rect">
+                      <a:avLst/>
+                    </a:prstGeom>
+                  </pic:spPr>
+                </pic:pic>
+              </a:graphicData>
+            </a:graphic>
+          </wp:inline>
+        </w:drawing>
+      </w:r>
+    </w:p>
+    <w:p>
+      <w:r>
+        <w:t>Completion of the projects that are completed by me.</w:t>
+      </w:r>
+      <w:r>
+        <w:br/>
+      </w:r>
+    </w:p>
+    <w:p>
+      <w:r>
+        <w:t>Achievement Page.</w:t>
+      </w:r>
+      <w:r>
+        <w:br/>
+      </w:r>
+      <w:r>
+        <w:br/>
+        <w:t xml:space="preserve">The page seems to be good and but I want you to make sure that the achievements and the </w:t>
+      </w:r>
+      <w:proofErr w:type="spellStart"/>
+      <w:r>
+        <w:t>eca</w:t>
+      </w:r>
+      <w:proofErr w:type="spellEnd"/>
+      <w:r>
+        <w:t xml:space="preserve"> mentioned are based on the date on which they were performed or achieved.</w:t>
+      </w:r>
+    </w:p>
+    <w:p/>
+    <w:p>
+      <w:r>
+        <w:t xml:space="preserve">About </w:t>
+      </w:r>
+      <w:proofErr w:type="gramStart"/>
+      <w:r>
+        <w:t>Me</w:t>
+      </w:r>
+      <w:proofErr w:type="gramEnd"/>
+      <w:r>
+        <w:t xml:space="preserve"> Page.</w:t>
+      </w:r>
+    </w:p>
+    <w:p>
+      <w:r>
+        <w:t>The page seems to working good here on the local host but the page when hosted can’t display the slider, so can you check that all the structure is working well and I can see the same when hosted into the domain as I have been seeing in the local host.</w:t>
+      </w:r>
+      <w:r>
+        <w:br/>
+      </w:r>
+    </w:p>
+    <w:p/>
+    <w:p/>
+    <w:p>
+      <w:r>
+        <w:lastRenderedPageBreak/>
+        <w:t>Note:</w:t>
+      </w:r>
+    </w:p>
+    <w:p>
+      <w:r>
+        <w:t xml:space="preserve">For the videos uploaded into the pages inside the web, what is the best method to load them, using the </w:t>
+      </w:r>
+      <w:proofErr w:type="spellStart"/>
+      <w:r>
+        <w:t>github</w:t>
+      </w:r>
+      <w:proofErr w:type="spellEnd"/>
+      <w:r>
+        <w:t xml:space="preserve"> or uploading into the site itself, which one makes the site fast in loading and visualization maintaining the original quality of the video.</w:t>
+      </w:r>
+    </w:p>
+    <w:p/>
+    <w:p>
+      <w:pPr>
+        <w:rPr>
+          <w:b/>
+        </w:rPr>
+      </w:pPr>
+      <w:r>
+        <w:rPr>
+          <w:b/>
+        </w:rPr>
+        <w:t>PHASE 2: INTERGRATION OF AI INTO THE WEB.</w:t>
+      </w:r>
+    </w:p>
+    <w:p>
+      <w:r>
+        <w:t xml:space="preserve">In this phase, I want to </w:t>
+      </w:r>
+      <w:proofErr w:type="spellStart"/>
+      <w:r>
+        <w:t>intergrate</w:t>
+      </w:r>
+      <w:proofErr w:type="spellEnd"/>
+      <w:r>
+        <w:t xml:space="preserve"> </w:t>
+      </w:r>
+      <w:proofErr w:type="spellStart"/>
+      <w:r>
+        <w:t>ai</w:t>
+      </w:r>
+      <w:proofErr w:type="spellEnd"/>
+      <w:r>
+        <w:t xml:space="preserve"> into the system which will be working into the following tasks that helps into the automation of the project.</w:t>
+      </w:r>
+    </w:p>
+    <w:p>
+      <w:r>
+        <w:t>The task are as follow:</w:t>
+      </w:r>
+    </w:p>
+    <w:p>
+      <w:pPr>
+        <w:pStyle w:val="ListParagraph"/>
+        <w:numPr>
+          <w:ilvl w:val="0"/>
+          <w:numId w:val="3"/>
+        </w:numPr>
+      </w:pPr>
+      <w:r>
+        <w:t xml:space="preserve">The admin doesn’t need to change into the code itself as there will be </w:t>
+      </w:r>
+      <w:proofErr w:type="spellStart"/>
+      <w:r>
+        <w:t>ai</w:t>
+      </w:r>
+      <w:proofErr w:type="spellEnd"/>
+      <w:r>
+        <w:t xml:space="preserve"> that will listen to the admin and make the update like adding the projects and its detail, the owner will give the pdf or word file that will be scanned and added into the respective section as if it is project, </w:t>
+      </w:r>
+      <w:proofErr w:type="spellStart"/>
+      <w:r>
+        <w:t>eca</w:t>
+      </w:r>
+      <w:proofErr w:type="spellEnd"/>
+      <w:r>
+        <w:t xml:space="preserve"> or and training.</w:t>
+      </w:r>
+      <w:r>
+        <w:t xml:space="preserve"> The scanning of the </w:t>
+      </w:r>
+      <w:proofErr w:type="spellStart"/>
+      <w:r>
+        <w:t>the</w:t>
+      </w:r>
+      <w:proofErr w:type="spellEnd"/>
+      <w:r>
+        <w:t xml:space="preserve"> file submitted should be able to scan the details, the images </w:t>
+      </w:r>
+      <w:proofErr w:type="spellStart"/>
+      <w:r>
+        <w:t>metioned</w:t>
+      </w:r>
+      <w:proofErr w:type="spellEnd"/>
+      <w:r>
+        <w:t xml:space="preserve"> or attached with the file and write about it into the webpage</w:t>
+      </w:r>
+      <w:r>
+        <w:t>.</w:t>
+      </w:r>
+    </w:p>
+    <w:p>
+      <w:pPr>
+        <w:pStyle w:val="ListParagraph"/>
+        <w:numPr>
+          <w:ilvl w:val="0"/>
+          <w:numId w:val="3"/>
+        </w:numPr>
+      </w:pPr>
+      <w:r>
+        <w:t xml:space="preserve">Checking of the email address as any fake mail can submit the contact form and send mail. What can be done to make for that so that I can get the genuine mail only to contact </w:t>
+      </w:r>
+      <w:proofErr w:type="gramStart"/>
+      <w:r>
+        <w:t>me.</w:t>
+      </w:r>
+      <w:proofErr w:type="gramEnd"/>
+    </w:p>
+    <w:p>
+      <w:pPr>
+        <w:pStyle w:val="ListParagraph"/>
+        <w:numPr>
+          <w:ilvl w:val="0"/>
+          <w:numId w:val="3"/>
+        </w:numPr>
+      </w:pPr>
+      <w:r>
+        <w:t>The admin should have control over all the section of the webpage so that anything can be changed easily without touching the code. For that, a admin from non tech background can pe</w:t>
+      </w:r>
+      <w:r>
+        <w:t>rform the hand</w:t>
+      </w:r>
+      <w:r>
+        <w:t>l</w:t>
       </w:r>
       <w:bookmarkStart w:id="0" w:name="_GoBack"/>
       <w:bookmarkEnd w:id="0"/>
       <w:r>
-        <w:t xml:space="preserve"> without any  great effort in future.</w:t>
-      </w:r>
-    </w:p>
-    <w:p>
-      <w:r>
-        <w:t xml:space="preserve"> </w:t>
+        <w:t>ing of the project.</w:t>
       </w:r>
     </w:p>
     <w:sectPr>
@@ -6493,6 +6882,95 @@
 <file path=word/numbering.xml><?xml version="1.0" encoding="utf-8"?>
 <w:numbering xmlns:wpc="http://schemas.microsoft.com/office/word/2010/wordprocessingCanvas" xmlns:cx="http://schemas.microsoft.com/office/drawing/2014/chartex" xmlns:cx1="http://schemas.microsoft.com/office/drawing/2015/9/8/chartex" xmlns:mc="http://schemas.openxmlformats.org/markup-compatibility/2006" xmlns:o="urn:schemas-microsoft-com:office:office" xmlns:r="http://schemas.openxmlformats.org/officeDocument/2006/relationships" xmlns:m="http://schemas.openxmlformats.org/officeDocument/2006/math" xmlns:v="urn:schemas-microsoft-com:vml" xmlns:wp14="http://schemas.microsoft.com/office/word/2010/wordprocessingDrawing" xmlns:wp="http://schemas.openxmlformats.org/drawingml/2006/wordprocessingDrawing" xmlns:w10="urn:schemas-microsoft-com:office:word" xmlns:w="http://schemas.openxmlformats.org/wordprocessingml/2006/main" xmlns:w14="http://schemas.microsoft.com/office/word/2010/wordml" xmlns:w15="http://schemas.microsoft.com/office/word/2012/wordml" xmlns:w16se="http://schemas.microsoft.com/office/word/2015/wordml/symex" xmlns:wpg="http://schemas.microsoft.com/office/word/2010/wordprocessingGroup" xmlns:wpi="http://schemas.microsoft.com/office/word/2010/wordprocessingInk" xmlns:wne="http://schemas.microsoft.com/office/word/2006/wordml" xmlns:wps="http://schemas.microsoft.com/office/word/2010/wordprocessingShape" mc:Ignorable="w14 w15 w16se wp14">
   <w:abstractNum w:abstractNumId="0" w15:restartNumberingAfterBreak="0">
+    <w:nsid w:val="0BE45F98"/>
+    <w:multiLevelType w:val="hybridMultilevel"/>
+    <w:tmpl w:val="45C2A546"/>
+    <w:lvl w:ilvl="0" w:tplc="0409000F">
+      <w:start w:val="1"/>
+      <w:numFmt w:val="decimal"/>
+      <w:lvlText w:val="%1."/>
+      <w:lvlJc w:val="left"/>
+      <w:pPr>
+        <w:ind w:left="720" w:hanging="360"/>
+      </w:pPr>
+      <w:rPr>
+        <w:rFonts w:hint="default"/>
+      </w:rPr>
+    </w:lvl>
+    <w:lvl w:ilvl="1" w:tplc="04090019" w:tentative="1">
+      <w:start w:val="1"/>
+      <w:numFmt w:val="lowerLetter"/>
+      <w:lvlText w:val="%2."/>
+      <w:lvlJc w:val="left"/>
+      <w:pPr>
+        <w:ind w:left="1440" w:hanging="360"/>
+      </w:pPr>
+    </w:lvl>
+    <w:lvl w:ilvl="2" w:tplc="0409001B" w:tentative="1">
+      <w:start w:val="1"/>
+      <w:numFmt w:val="lowerRoman"/>
+      <w:lvlText w:val="%3."/>
+      <w:lvlJc w:val="right"/>
+      <w:pPr>
+        <w:ind w:left="2160" w:hanging="180"/>
+      </w:pPr>
+    </w:lvl>
+    <w:lvl w:ilvl="3" w:tplc="0409000F" w:tentative="1">
+      <w:start w:val="1"/>
+      <w:numFmt w:val="decimal"/>
+      <w:lvlText w:val="%4."/>
+      <w:lvlJc w:val="left"/>
+      <w:pPr>
+        <w:ind w:left="2880" w:hanging="360"/>
+      </w:pPr>
+    </w:lvl>
+    <w:lvl w:ilvl="4" w:tplc="04090019" w:tentative="1">
+      <w:start w:val="1"/>
+      <w:numFmt w:val="lowerLetter"/>
+      <w:lvlText w:val="%5."/>
+      <w:lvlJc w:val="left"/>
+      <w:pPr>
+        <w:ind w:left="3600" w:hanging="360"/>
+      </w:pPr>
+    </w:lvl>
+    <w:lvl w:ilvl="5" w:tplc="0409001B" w:tentative="1">
+      <w:start w:val="1"/>
+      <w:numFmt w:val="lowerRoman"/>
+      <w:lvlText w:val="%6."/>
+      <w:lvlJc w:val="right"/>
+      <w:pPr>
+        <w:ind w:left="4320" w:hanging="180"/>
+      </w:pPr>
+    </w:lvl>
+    <w:lvl w:ilvl="6" w:tplc="0409000F" w:tentative="1">
+      <w:start w:val="1"/>
+      <w:numFmt w:val="decimal"/>
+      <w:lvlText w:val="%7."/>
+      <w:lvlJc w:val="left"/>
+      <w:pPr>
+        <w:ind w:left="5040" w:hanging="360"/>
+      </w:pPr>
+    </w:lvl>
+    <w:lvl w:ilvl="7" w:tplc="04090019" w:tentative="1">
+      <w:start w:val="1"/>
+      <w:numFmt w:val="lowerLetter"/>
+      <w:lvlText w:val="%8."/>
+      <w:lvlJc w:val="left"/>
+      <w:pPr>
+        <w:ind w:left="5760" w:hanging="360"/>
+      </w:pPr>
+    </w:lvl>
+    <w:lvl w:ilvl="8" w:tplc="0409001B" w:tentative="1">
+      <w:start w:val="1"/>
+      <w:numFmt w:val="lowerRoman"/>
+      <w:lvlText w:val="%9."/>
+      <w:lvlJc w:val="right"/>
+      <w:pPr>
+        <w:ind w:left="6480" w:hanging="180"/>
+      </w:pPr>
+    </w:lvl>
+  </w:abstractNum>
+  <w:abstractNum w:abstractNumId="1" w15:restartNumberingAfterBreak="0">
     <w:nsid w:val="538D7CF3"/>
     <w:multiLevelType w:val="multilevel"/>
     <w:tmpl w:val="AA4CD602"/>
@@ -6641,7 +7119,7 @@
       </w:rPr>
     </w:lvl>
   </w:abstractNum>
-  <w:abstractNum w:abstractNumId="1" w15:restartNumberingAfterBreak="0">
+  <w:abstractNum w:abstractNumId="2" w15:restartNumberingAfterBreak="0">
     <w:nsid w:val="54AB7D95"/>
     <w:multiLevelType w:val="multilevel"/>
     <w:tmpl w:val="3940B69C"/>
@@ -6791,10 +7269,13 @@
     </w:lvl>
   </w:abstractNum>
   <w:num w:numId="1">
-    <w:abstractNumId w:val="0"/>
+    <w:abstractNumId w:val="1"/>
   </w:num>
   <w:num w:numId="2">
-    <w:abstractNumId w:val="1"/>
+    <w:abstractNumId w:val="2"/>
+  </w:num>
+  <w:num w:numId="3">
+    <w:abstractNumId w:val="0"/>
   </w:num>
 </w:numbering>
 </file>
@@ -7279,6 +7760,17 @@
       <w:szCs w:val="24"/>
     </w:rPr>
   </w:style>
+  <w:style w:type="paragraph" w:styleId="ListParagraph">
+    <w:name w:val="List Paragraph"/>
+    <w:basedOn w:val="Normal"/>
+    <w:uiPriority w:val="34"/>
+    <w:qFormat/>
+    <w:rsid w:val="00FA35C9"/>
+    <w:pPr>
+      <w:ind w:left="720"/>
+      <w:contextualSpacing/>
+    </w:pPr>
+  </w:style>
 </w:styles>
 </file>
 

</xml_diff>